<commit_message>
also added file directory and git repository to the document
</commit_message>
<xml_diff>
--- a/programming_assignments/PA2/PA1_zuha_aqib_26106.docx
+++ b/programming_assignments/PA2/PA1_zuha_aqib_26106.docx
@@ -108,6 +108,30 @@
     <w:p>
       <w:pPr>
         <w:spacing w:after="0" w:line="276" w:lineRule="auto"/>
+      </w:pPr>
+      <w:r>
+        <w:t xml:space="preserve">Everything has been maintained on my git repository on </w:t>
+      </w:r>
+      <w:hyperlink r:id="rId4" w:history="1">
+        <w:r>
+          <w:rPr>
+            <w:rStyle w:val="Hyperlink"/>
+          </w:rPr>
+          <w:t>https://github.com/z-aqib/CSE355_Introduction-to-Blockchain</w:t>
+        </w:r>
+      </w:hyperlink>
+      <w:r>
+        <w:t>. I have attached the file directory of my folder PA2 as well. I am also attaching the console/terminal proof of all test cases passed successfully.</w:t>
+      </w:r>
+    </w:p>
+    <w:p>
+      <w:pPr>
+        <w:spacing w:after="0" w:line="276" w:lineRule="auto"/>
+      </w:pPr>
+    </w:p>
+    <w:p>
+      <w:pPr>
+        <w:spacing w:after="0" w:line="276" w:lineRule="auto"/>
         <w:rPr>
           <w:u w:val="single"/>
         </w:rPr>
@@ -138,21 +162,7 @@
         <w:rPr>
           <w:rFonts w:ascii="Times New Roman" w:hAnsi="Times New Roman" w:cs="Times New Roman"/>
         </w:rPr>
-        <w:t xml:space="preserve">PA2&gt; </w:t>
-      </w:r>
-      <w:proofErr w:type="spellStart"/>
-      <w:r>
-        <w:rPr>
-          <w:rFonts w:ascii="Times New Roman" w:hAnsi="Times New Roman" w:cs="Times New Roman"/>
-        </w:rPr>
-        <w:t>npx</w:t>
-      </w:r>
-      <w:proofErr w:type="spellEnd"/>
-      <w:r>
-        <w:rPr>
-          <w:rFonts w:ascii="Times New Roman" w:hAnsi="Times New Roman" w:cs="Times New Roman"/>
-        </w:rPr>
-        <w:t xml:space="preserve"> hardhat test</w:t>
+        <w:t>&gt; npx hardhat test</w:t>
       </w:r>
     </w:p>
     <w:p>
@@ -621,164 +631,6 @@
           <w:rFonts w:ascii="Times New Roman" w:hAnsi="Times New Roman" w:cs="Times New Roman"/>
         </w:rPr>
         <w:t xml:space="preserve"> 7_Test</w:t>
-      </w:r>
-    </w:p>
-    <w:p>
-      <w:pPr>
-        <w:spacing w:after="0" w:line="276" w:lineRule="auto"/>
-        <w:rPr>
-          <w:rFonts w:ascii="Times New Roman" w:hAnsi="Times New Roman" w:cs="Times New Roman"/>
-        </w:rPr>
-      </w:pPr>
-      <w:r>
-        <w:rPr>
-          <w:rFonts w:ascii="Times New Roman" w:hAnsi="Times New Roman" w:cs="Times New Roman"/>
-        </w:rPr>
-        <w:t xml:space="preserve">    </w:t>
-      </w:r>
-      <w:r>
-        <w:rPr>
-          <w:rFonts w:ascii="Segoe UI Symbol" w:hAnsi="Segoe UI Symbol" w:cs="Segoe UI Symbol"/>
-        </w:rPr>
-        <w:t>✔</w:t>
-      </w:r>
-      <w:r>
-        <w:rPr>
-          <w:rFonts w:ascii="Times New Roman" w:hAnsi="Times New Roman" w:cs="Times New Roman"/>
-        </w:rPr>
-        <w:t xml:space="preserve"> 8_Test</w:t>
-      </w:r>
-    </w:p>
-    <w:p>
-      <w:pPr>
-        <w:spacing w:after="0" w:line="276" w:lineRule="auto"/>
-        <w:rPr>
-          <w:rFonts w:ascii="Times New Roman" w:hAnsi="Times New Roman" w:cs="Times New Roman"/>
-        </w:rPr>
-      </w:pPr>
-      <w:r>
-        <w:rPr>
-          <w:rFonts w:ascii="Times New Roman" w:hAnsi="Times New Roman" w:cs="Times New Roman"/>
-        </w:rPr>
-        <w:t xml:space="preserve">    </w:t>
-      </w:r>
-      <w:r>
-        <w:rPr>
-          <w:rFonts w:ascii="Segoe UI Symbol" w:hAnsi="Segoe UI Symbol" w:cs="Segoe UI Symbol"/>
-        </w:rPr>
-        <w:t>✔</w:t>
-      </w:r>
-      <w:r>
-        <w:rPr>
-          <w:rFonts w:ascii="Times New Roman" w:hAnsi="Times New Roman" w:cs="Times New Roman"/>
-        </w:rPr>
-        <w:t xml:space="preserve"> 9_Test</w:t>
-      </w:r>
-    </w:p>
-    <w:p>
-      <w:pPr>
-        <w:spacing w:after="0" w:line="276" w:lineRule="auto"/>
-        <w:rPr>
-          <w:rFonts w:ascii="Times New Roman" w:hAnsi="Times New Roman" w:cs="Times New Roman"/>
-        </w:rPr>
-      </w:pPr>
-      <w:r>
-        <w:rPr>
-          <w:rFonts w:ascii="Times New Roman" w:hAnsi="Times New Roman" w:cs="Times New Roman"/>
-        </w:rPr>
-        <w:t xml:space="preserve">    </w:t>
-      </w:r>
-      <w:r>
-        <w:rPr>
-          <w:rFonts w:ascii="Segoe UI Symbol" w:hAnsi="Segoe UI Symbol" w:cs="Segoe UI Symbol"/>
-        </w:rPr>
-        <w:t>✔</w:t>
-      </w:r>
-      <w:r>
-        <w:rPr>
-          <w:rFonts w:ascii="Times New Roman" w:hAnsi="Times New Roman" w:cs="Times New Roman"/>
-        </w:rPr>
-        <w:t xml:space="preserve"> 10_Test</w:t>
-      </w:r>
-    </w:p>
-    <w:p>
-      <w:pPr>
-        <w:spacing w:after="0" w:line="276" w:lineRule="auto"/>
-        <w:rPr>
-          <w:rFonts w:ascii="Times New Roman" w:hAnsi="Times New Roman" w:cs="Times New Roman"/>
-        </w:rPr>
-      </w:pPr>
-      <w:r>
-        <w:rPr>
-          <w:rFonts w:ascii="Times New Roman" w:hAnsi="Times New Roman" w:cs="Times New Roman"/>
-        </w:rPr>
-        <w:t xml:space="preserve">    </w:t>
-      </w:r>
-      <w:r>
-        <w:rPr>
-          <w:rFonts w:ascii="Segoe UI Symbol" w:hAnsi="Segoe UI Symbol" w:cs="Segoe UI Symbol"/>
-        </w:rPr>
-        <w:t>✔</w:t>
-      </w:r>
-      <w:r>
-        <w:rPr>
-          <w:rFonts w:ascii="Times New Roman" w:hAnsi="Times New Roman" w:cs="Times New Roman"/>
-        </w:rPr>
-        <w:t xml:space="preserve"> </w:t>
-      </w:r>
-      <w:proofErr w:type="gramStart"/>
-      <w:r>
-        <w:rPr>
-          <w:rFonts w:ascii="Times New Roman" w:hAnsi="Times New Roman" w:cs="Times New Roman"/>
-        </w:rPr>
-        <w:t>11._</w:t>
-      </w:r>
-      <w:proofErr w:type="gramEnd"/>
-      <w:r>
-        <w:rPr>
-          <w:rFonts w:ascii="Times New Roman" w:hAnsi="Times New Roman" w:cs="Times New Roman"/>
-        </w:rPr>
-        <w:t>Test</w:t>
-      </w:r>
-    </w:p>
-    <w:p>
-      <w:pPr>
-        <w:spacing w:after="0" w:line="276" w:lineRule="auto"/>
-        <w:rPr>
-          <w:rFonts w:ascii="Times New Roman" w:hAnsi="Times New Roman" w:cs="Times New Roman"/>
-        </w:rPr>
-      </w:pPr>
-      <w:r>
-        <w:rPr>
-          <w:rFonts w:ascii="Times New Roman" w:hAnsi="Times New Roman" w:cs="Times New Roman"/>
-        </w:rPr>
-        <w:t xml:space="preserve">    </w:t>
-      </w:r>
-      <w:r>
-        <w:rPr>
-          <w:rFonts w:ascii="Segoe UI Symbol" w:hAnsi="Segoe UI Symbol" w:cs="Segoe UI Symbol"/>
-        </w:rPr>
-        <w:t>✔</w:t>
-      </w:r>
-      <w:r>
-        <w:rPr>
-          <w:rFonts w:ascii="Times New Roman" w:hAnsi="Times New Roman" w:cs="Times New Roman"/>
-        </w:rPr>
-        <w:t xml:space="preserve"> </w:t>
-      </w:r>
-      <w:proofErr w:type="gramStart"/>
-      <w:r>
-        <w:rPr>
-          <w:rFonts w:ascii="Times New Roman" w:hAnsi="Times New Roman" w:cs="Times New Roman"/>
-        </w:rPr>
-        <w:t>12._</w:t>
-      </w:r>
-      <w:proofErr w:type="gramEnd"/>
-      <w:r>
-        <w:rPr>
-          <w:rFonts w:ascii="Times New Roman" w:hAnsi="Times New Roman" w:cs="Times New Roman"/>
-        </w:rPr>
-        <w:t>Test</w:t>
       </w:r>
     </w:p>
     <w:p>
@@ -805,6 +657,84 @@
         <w:rPr>
           <w:rFonts w:ascii="Times New Roman" w:hAnsi="Times New Roman" w:cs="Times New Roman"/>
         </w:rPr>
+        <w:t xml:space="preserve"> 8_Test</w:t>
+      </w:r>
+    </w:p>
+    <w:p>
+      <w:pPr>
+        <w:spacing w:after="0" w:line="276" w:lineRule="auto"/>
+        <w:rPr>
+          <w:rFonts w:ascii="Times New Roman" w:hAnsi="Times New Roman" w:cs="Times New Roman"/>
+        </w:rPr>
+      </w:pPr>
+      <w:r>
+        <w:rPr>
+          <w:rFonts w:ascii="Times New Roman" w:hAnsi="Times New Roman" w:cs="Times New Roman"/>
+        </w:rPr>
+        <w:t xml:space="preserve">    </w:t>
+      </w:r>
+      <w:r>
+        <w:rPr>
+          <w:rFonts w:ascii="Segoe UI Symbol" w:hAnsi="Segoe UI Symbol" w:cs="Segoe UI Symbol"/>
+        </w:rPr>
+        <w:t>✔</w:t>
+      </w:r>
+      <w:r>
+        <w:rPr>
+          <w:rFonts w:ascii="Times New Roman" w:hAnsi="Times New Roman" w:cs="Times New Roman"/>
+        </w:rPr>
+        <w:t xml:space="preserve"> 9_Test</w:t>
+      </w:r>
+    </w:p>
+    <w:p>
+      <w:pPr>
+        <w:spacing w:after="0" w:line="276" w:lineRule="auto"/>
+        <w:rPr>
+          <w:rFonts w:ascii="Times New Roman" w:hAnsi="Times New Roman" w:cs="Times New Roman"/>
+        </w:rPr>
+      </w:pPr>
+      <w:r>
+        <w:rPr>
+          <w:rFonts w:ascii="Times New Roman" w:hAnsi="Times New Roman" w:cs="Times New Roman"/>
+        </w:rPr>
+        <w:t xml:space="preserve">    </w:t>
+      </w:r>
+      <w:r>
+        <w:rPr>
+          <w:rFonts w:ascii="Segoe UI Symbol" w:hAnsi="Segoe UI Symbol" w:cs="Segoe UI Symbol"/>
+        </w:rPr>
+        <w:t>✔</w:t>
+      </w:r>
+      <w:r>
+        <w:rPr>
+          <w:rFonts w:ascii="Times New Roman" w:hAnsi="Times New Roman" w:cs="Times New Roman"/>
+        </w:rPr>
+        <w:t xml:space="preserve"> 10_Test</w:t>
+      </w:r>
+    </w:p>
+    <w:p>
+      <w:pPr>
+        <w:spacing w:after="0" w:line="276" w:lineRule="auto"/>
+        <w:rPr>
+          <w:rFonts w:ascii="Times New Roman" w:hAnsi="Times New Roman" w:cs="Times New Roman"/>
+        </w:rPr>
+      </w:pPr>
+      <w:r>
+        <w:rPr>
+          <w:rFonts w:ascii="Times New Roman" w:hAnsi="Times New Roman" w:cs="Times New Roman"/>
+        </w:rPr>
+        <w:t xml:space="preserve">    </w:t>
+      </w:r>
+      <w:r>
+        <w:rPr>
+          <w:rFonts w:ascii="Segoe UI Symbol" w:hAnsi="Segoe UI Symbol" w:cs="Segoe UI Symbol"/>
+        </w:rPr>
+        <w:t>✔</w:t>
+      </w:r>
+      <w:r>
+        <w:rPr>
+          <w:rFonts w:ascii="Times New Roman" w:hAnsi="Times New Roman" w:cs="Times New Roman"/>
+        </w:rPr>
         <w:t xml:space="preserve"> </w:t>
       </w:r>
       <w:proofErr w:type="gramStart"/>
@@ -812,6 +742,86 @@
         <w:rPr>
           <w:rFonts w:ascii="Times New Roman" w:hAnsi="Times New Roman" w:cs="Times New Roman"/>
         </w:rPr>
+        <w:t>11._</w:t>
+      </w:r>
+      <w:proofErr w:type="gramEnd"/>
+      <w:r>
+        <w:rPr>
+          <w:rFonts w:ascii="Times New Roman" w:hAnsi="Times New Roman" w:cs="Times New Roman"/>
+        </w:rPr>
+        <w:t>Test</w:t>
+      </w:r>
+    </w:p>
+    <w:p>
+      <w:pPr>
+        <w:spacing w:after="0" w:line="276" w:lineRule="auto"/>
+        <w:rPr>
+          <w:rFonts w:ascii="Times New Roman" w:hAnsi="Times New Roman" w:cs="Times New Roman"/>
+        </w:rPr>
+      </w:pPr>
+      <w:r>
+        <w:rPr>
+          <w:rFonts w:ascii="Times New Roman" w:hAnsi="Times New Roman" w:cs="Times New Roman"/>
+        </w:rPr>
+        <w:t xml:space="preserve">    </w:t>
+      </w:r>
+      <w:r>
+        <w:rPr>
+          <w:rFonts w:ascii="Segoe UI Symbol" w:hAnsi="Segoe UI Symbol" w:cs="Segoe UI Symbol"/>
+        </w:rPr>
+        <w:t>✔</w:t>
+      </w:r>
+      <w:r>
+        <w:rPr>
+          <w:rFonts w:ascii="Times New Roman" w:hAnsi="Times New Roman" w:cs="Times New Roman"/>
+        </w:rPr>
+        <w:t xml:space="preserve"> </w:t>
+      </w:r>
+      <w:proofErr w:type="gramStart"/>
+      <w:r>
+        <w:rPr>
+          <w:rFonts w:ascii="Times New Roman" w:hAnsi="Times New Roman" w:cs="Times New Roman"/>
+        </w:rPr>
+        <w:t>12._</w:t>
+      </w:r>
+      <w:proofErr w:type="gramEnd"/>
+      <w:r>
+        <w:rPr>
+          <w:rFonts w:ascii="Times New Roman" w:hAnsi="Times New Roman" w:cs="Times New Roman"/>
+        </w:rPr>
+        <w:t>Test</w:t>
+      </w:r>
+    </w:p>
+    <w:p>
+      <w:pPr>
+        <w:spacing w:after="0" w:line="276" w:lineRule="auto"/>
+        <w:rPr>
+          <w:rFonts w:ascii="Times New Roman" w:hAnsi="Times New Roman" w:cs="Times New Roman"/>
+        </w:rPr>
+      </w:pPr>
+      <w:r>
+        <w:rPr>
+          <w:rFonts w:ascii="Times New Roman" w:hAnsi="Times New Roman" w:cs="Times New Roman"/>
+        </w:rPr>
+        <w:t xml:space="preserve">    </w:t>
+      </w:r>
+      <w:r>
+        <w:rPr>
+          <w:rFonts w:ascii="Segoe UI Symbol" w:hAnsi="Segoe UI Symbol" w:cs="Segoe UI Symbol"/>
+        </w:rPr>
+        <w:t>✔</w:t>
+      </w:r>
+      <w:r>
+        <w:rPr>
+          <w:rFonts w:ascii="Times New Roman" w:hAnsi="Times New Roman" w:cs="Times New Roman"/>
+        </w:rPr>
+        <w:t xml:space="preserve"> </w:t>
+      </w:r>
+      <w:proofErr w:type="gramStart"/>
+      <w:r>
+        <w:rPr>
+          <w:rFonts w:ascii="Times New Roman" w:hAnsi="Times New Roman" w:cs="Times New Roman"/>
+        </w:rPr>
         <w:t>13._</w:t>
       </w:r>
       <w:proofErr w:type="gramEnd"/>
@@ -1567,6 +1577,7 @@
         <w:rPr>
           <w:rFonts w:ascii="Times New Roman" w:hAnsi="Times New Roman" w:cs="Times New Roman"/>
         </w:rPr>
+        <w:lastRenderedPageBreak/>
         <w:t xml:space="preserve">  Owner Rights</w:t>
       </w:r>
     </w:p>
@@ -1685,181 +1696,3124 @@
         <w:rPr>
           <w:rFonts w:ascii="Times New Roman" w:hAnsi="Times New Roman" w:cs="Times New Roman"/>
         </w:rPr>
+        <w:t xml:space="preserve">    </w:t>
+      </w:r>
+      <w:r>
+        <w:rPr>
+          <w:rFonts w:ascii="Segoe UI Symbol" w:hAnsi="Segoe UI Symbol" w:cs="Segoe UI Symbol"/>
+        </w:rPr>
+        <w:t>✔</w:t>
+      </w:r>
+      <w:r>
+        <w:rPr>
+          <w:rFonts w:ascii="Times New Roman" w:hAnsi="Times New Roman" w:cs="Times New Roman"/>
+        </w:rPr>
+        <w:t xml:space="preserve"> 5_Test</w:t>
+      </w:r>
+    </w:p>
+    <w:p>
+      <w:pPr>
+        <w:spacing w:after="0" w:line="276" w:lineRule="auto"/>
+        <w:rPr>
+          <w:rFonts w:ascii="Times New Roman" w:hAnsi="Times New Roman" w:cs="Times New Roman"/>
+        </w:rPr>
+      </w:pPr>
+      <w:r>
+        <w:rPr>
+          <w:rFonts w:ascii="Times New Roman" w:hAnsi="Times New Roman" w:cs="Times New Roman"/>
+        </w:rPr>
+        <w:t xml:space="preserve">    </w:t>
+      </w:r>
+      <w:r>
+        <w:rPr>
+          <w:rFonts w:ascii="Segoe UI Symbol" w:hAnsi="Segoe UI Symbol" w:cs="Segoe UI Symbol"/>
+        </w:rPr>
+        <w:t>✔</w:t>
+      </w:r>
+      <w:r>
+        <w:rPr>
+          <w:rFonts w:ascii="Times New Roman" w:hAnsi="Times New Roman" w:cs="Times New Roman"/>
+        </w:rPr>
+        <w:t xml:space="preserve"> 6_Test</w:t>
+      </w:r>
+    </w:p>
+    <w:p>
+      <w:pPr>
+        <w:spacing w:after="0" w:line="276" w:lineRule="auto"/>
+        <w:rPr>
+          <w:rFonts w:ascii="Times New Roman" w:hAnsi="Times New Roman" w:cs="Times New Roman"/>
+        </w:rPr>
+      </w:pPr>
+      <w:r>
+        <w:rPr>
+          <w:rFonts w:ascii="Times New Roman" w:hAnsi="Times New Roman" w:cs="Times New Roman"/>
+        </w:rPr>
+        <w:t xml:space="preserve">    </w:t>
+      </w:r>
+      <w:r>
+        <w:rPr>
+          <w:rFonts w:ascii="Segoe UI Symbol" w:hAnsi="Segoe UI Symbol" w:cs="Segoe UI Symbol"/>
+        </w:rPr>
+        <w:t>✔</w:t>
+      </w:r>
+      <w:r>
+        <w:rPr>
+          <w:rFonts w:ascii="Times New Roman" w:hAnsi="Times New Roman" w:cs="Times New Roman"/>
+        </w:rPr>
+        <w:t xml:space="preserve"> 7_Test</w:t>
+      </w:r>
+    </w:p>
+    <w:p>
+      <w:pPr>
+        <w:spacing w:after="0" w:line="276" w:lineRule="auto"/>
+        <w:rPr>
+          <w:rFonts w:ascii="Times New Roman" w:hAnsi="Times New Roman" w:cs="Times New Roman"/>
+        </w:rPr>
+      </w:pPr>
+      <w:r>
+        <w:rPr>
+          <w:rFonts w:ascii="Times New Roman" w:hAnsi="Times New Roman" w:cs="Times New Roman"/>
+        </w:rPr>
+        <w:t xml:space="preserve">    </w:t>
+      </w:r>
+      <w:r>
+        <w:rPr>
+          <w:rFonts w:ascii="Segoe UI Symbol" w:hAnsi="Segoe UI Symbol" w:cs="Segoe UI Symbol"/>
+        </w:rPr>
+        <w:t>✔</w:t>
+      </w:r>
+      <w:r>
+        <w:rPr>
+          <w:rFonts w:ascii="Times New Roman" w:hAnsi="Times New Roman" w:cs="Times New Roman"/>
+        </w:rPr>
+        <w:t xml:space="preserve"> 8_Test</w:t>
+      </w:r>
+    </w:p>
+    <w:p>
+      <w:pPr>
+        <w:spacing w:after="0" w:line="276" w:lineRule="auto"/>
+        <w:rPr>
+          <w:rFonts w:ascii="Times New Roman" w:hAnsi="Times New Roman" w:cs="Times New Roman"/>
+        </w:rPr>
+      </w:pPr>
+      <w:r>
+        <w:rPr>
+          <w:rFonts w:ascii="Times New Roman" w:hAnsi="Times New Roman" w:cs="Times New Roman"/>
+        </w:rPr>
+        <w:t xml:space="preserve">    </w:t>
+      </w:r>
+      <w:r>
+        <w:rPr>
+          <w:rFonts w:ascii="Segoe UI Symbol" w:hAnsi="Segoe UI Symbol" w:cs="Segoe UI Symbol"/>
+        </w:rPr>
+        <w:t>✔</w:t>
+      </w:r>
+      <w:r>
+        <w:rPr>
+          <w:rFonts w:ascii="Times New Roman" w:hAnsi="Times New Roman" w:cs="Times New Roman"/>
+        </w:rPr>
+        <w:t xml:space="preserve"> 9_Test</w:t>
+      </w:r>
+    </w:p>
+    <w:p>
+      <w:pPr>
+        <w:spacing w:after="0" w:line="276" w:lineRule="auto"/>
+        <w:rPr>
+          <w:rFonts w:ascii="Times New Roman" w:hAnsi="Times New Roman" w:cs="Times New Roman"/>
+        </w:rPr>
+      </w:pPr>
+      <w:r>
+        <w:rPr>
+          <w:rFonts w:ascii="Times New Roman" w:hAnsi="Times New Roman" w:cs="Times New Roman"/>
+        </w:rPr>
+        <w:t xml:space="preserve">    </w:t>
+      </w:r>
+      <w:r>
+        <w:rPr>
+          <w:rFonts w:ascii="Segoe UI Symbol" w:hAnsi="Segoe UI Symbol" w:cs="Segoe UI Symbol"/>
+        </w:rPr>
+        <w:t>✔</w:t>
+      </w:r>
+      <w:r>
+        <w:rPr>
+          <w:rFonts w:ascii="Times New Roman" w:hAnsi="Times New Roman" w:cs="Times New Roman"/>
+        </w:rPr>
+        <w:t xml:space="preserve"> 10_Test</w:t>
+      </w:r>
+    </w:p>
+    <w:p>
+      <w:pPr>
+        <w:spacing w:after="0" w:line="276" w:lineRule="auto"/>
+        <w:rPr>
+          <w:rFonts w:ascii="Times New Roman" w:hAnsi="Times New Roman" w:cs="Times New Roman"/>
+        </w:rPr>
+      </w:pPr>
+    </w:p>
+    <w:p>
+      <w:pPr>
+        <w:spacing w:after="0" w:line="276" w:lineRule="auto"/>
+        <w:rPr>
+          <w:rFonts w:ascii="Times New Roman" w:hAnsi="Times New Roman" w:cs="Times New Roman"/>
+        </w:rPr>
+      </w:pPr>
+    </w:p>
+    <w:p>
+      <w:pPr>
+        <w:spacing w:after="0" w:line="276" w:lineRule="auto"/>
+        <w:rPr>
+          <w:rFonts w:ascii="Times New Roman" w:hAnsi="Times New Roman" w:cs="Times New Roman"/>
+        </w:rPr>
+      </w:pPr>
+      <w:r>
+        <w:rPr>
+          <w:rFonts w:ascii="Times New Roman" w:hAnsi="Times New Roman" w:cs="Times New Roman"/>
+        </w:rPr>
+        <w:t xml:space="preserve">  52 passing (3s)</w:t>
+      </w:r>
+    </w:p>
+    <w:p>
+      <w:pPr>
+        <w:spacing w:after="0" w:line="276" w:lineRule="auto"/>
+        <w:rPr>
+          <w:rFonts w:ascii="Times New Roman" w:hAnsi="Times New Roman" w:cs="Times New Roman"/>
+        </w:rPr>
+      </w:pPr>
+    </w:p>
+    <w:p>
+      <w:pPr>
+        <w:rPr>
+          <w:rFonts w:ascii="Times New Roman" w:hAnsi="Times New Roman" w:cs="Times New Roman"/>
+        </w:rPr>
+      </w:pPr>
+      <w:r>
+        <w:rPr>
+          <w:rFonts w:ascii="Times New Roman" w:hAnsi="Times New Roman" w:cs="Times New Roman"/>
+        </w:rPr>
+        <w:br w:type="page"/>
+      </w:r>
+    </w:p>
+    <w:p>
+      <w:pPr>
+        <w:spacing w:after="0" w:line="276" w:lineRule="auto"/>
+        <w:rPr>
+          <w:rFonts w:ascii="Times New Roman" w:hAnsi="Times New Roman" w:cs="Times New Roman"/>
+          <w:u w:val="single"/>
+        </w:rPr>
+      </w:pPr>
+      <w:r>
+        <w:rPr>
+          <w:rFonts w:ascii="Times New Roman" w:hAnsi="Times New Roman" w:cs="Times New Roman"/>
+          <w:u w:val="single"/>
+        </w:rPr>
         <w:lastRenderedPageBreak/>
-        <w:t xml:space="preserve">    </w:t>
-      </w:r>
-      <w:r>
-        <w:rPr>
-          <w:rFonts w:ascii="Segoe UI Symbol" w:hAnsi="Segoe UI Symbol" w:cs="Segoe UI Symbol"/>
-        </w:rPr>
-        <w:t>✔</w:t>
-      </w:r>
-      <w:r>
-        <w:rPr>
-          <w:rFonts w:ascii="Times New Roman" w:hAnsi="Times New Roman" w:cs="Times New Roman"/>
-        </w:rPr>
-        <w:t xml:space="preserve"> 5_Test</w:t>
-      </w:r>
-    </w:p>
-    <w:p>
-      <w:pPr>
-        <w:spacing w:after="0" w:line="276" w:lineRule="auto"/>
-        <w:rPr>
-          <w:rFonts w:ascii="Times New Roman" w:hAnsi="Times New Roman" w:cs="Times New Roman"/>
-        </w:rPr>
-      </w:pPr>
-      <w:r>
-        <w:rPr>
-          <w:rFonts w:ascii="Times New Roman" w:hAnsi="Times New Roman" w:cs="Times New Roman"/>
-        </w:rPr>
-        <w:t xml:space="preserve">    </w:t>
-      </w:r>
-      <w:r>
-        <w:rPr>
-          <w:rFonts w:ascii="Segoe UI Symbol" w:hAnsi="Segoe UI Symbol" w:cs="Segoe UI Symbol"/>
-        </w:rPr>
-        <w:t>✔</w:t>
-      </w:r>
-      <w:r>
-        <w:rPr>
-          <w:rFonts w:ascii="Times New Roman" w:hAnsi="Times New Roman" w:cs="Times New Roman"/>
-        </w:rPr>
-        <w:t xml:space="preserve"> 6_Test</w:t>
-      </w:r>
-    </w:p>
-    <w:p>
-      <w:pPr>
-        <w:spacing w:after="0" w:line="276" w:lineRule="auto"/>
-        <w:rPr>
-          <w:rFonts w:ascii="Times New Roman" w:hAnsi="Times New Roman" w:cs="Times New Roman"/>
-        </w:rPr>
-      </w:pPr>
-      <w:r>
-        <w:rPr>
-          <w:rFonts w:ascii="Times New Roman" w:hAnsi="Times New Roman" w:cs="Times New Roman"/>
-        </w:rPr>
-        <w:t xml:space="preserve">    </w:t>
-      </w:r>
-      <w:r>
-        <w:rPr>
-          <w:rFonts w:ascii="Segoe UI Symbol" w:hAnsi="Segoe UI Symbol" w:cs="Segoe UI Symbol"/>
-        </w:rPr>
-        <w:t>✔</w:t>
-      </w:r>
-      <w:r>
-        <w:rPr>
-          <w:rFonts w:ascii="Times New Roman" w:hAnsi="Times New Roman" w:cs="Times New Roman"/>
-        </w:rPr>
-        <w:t xml:space="preserve"> 7_Test</w:t>
-      </w:r>
-    </w:p>
-    <w:p>
-      <w:pPr>
-        <w:spacing w:after="0" w:line="276" w:lineRule="auto"/>
-        <w:rPr>
-          <w:rFonts w:ascii="Times New Roman" w:hAnsi="Times New Roman" w:cs="Times New Roman"/>
-        </w:rPr>
-      </w:pPr>
-      <w:r>
-        <w:rPr>
-          <w:rFonts w:ascii="Times New Roman" w:hAnsi="Times New Roman" w:cs="Times New Roman"/>
-        </w:rPr>
-        <w:t xml:space="preserve">    </w:t>
-      </w:r>
-      <w:r>
-        <w:rPr>
-          <w:rFonts w:ascii="Segoe UI Symbol" w:hAnsi="Segoe UI Symbol" w:cs="Segoe UI Symbol"/>
-        </w:rPr>
-        <w:t>✔</w:t>
-      </w:r>
-      <w:r>
-        <w:rPr>
-          <w:rFonts w:ascii="Times New Roman" w:hAnsi="Times New Roman" w:cs="Times New Roman"/>
-        </w:rPr>
-        <w:t xml:space="preserve"> 8_Test</w:t>
-      </w:r>
-    </w:p>
-    <w:p>
-      <w:pPr>
-        <w:spacing w:after="0" w:line="276" w:lineRule="auto"/>
-        <w:rPr>
-          <w:rFonts w:ascii="Times New Roman" w:hAnsi="Times New Roman" w:cs="Times New Roman"/>
-        </w:rPr>
-      </w:pPr>
-      <w:r>
-        <w:rPr>
-          <w:rFonts w:ascii="Times New Roman" w:hAnsi="Times New Roman" w:cs="Times New Roman"/>
-        </w:rPr>
-        <w:t xml:space="preserve">    </w:t>
-      </w:r>
-      <w:r>
-        <w:rPr>
-          <w:rFonts w:ascii="Segoe UI Symbol" w:hAnsi="Segoe UI Symbol" w:cs="Segoe UI Symbol"/>
-        </w:rPr>
-        <w:t>✔</w:t>
-      </w:r>
-      <w:r>
-        <w:rPr>
-          <w:rFonts w:ascii="Times New Roman" w:hAnsi="Times New Roman" w:cs="Times New Roman"/>
-        </w:rPr>
-        <w:t xml:space="preserve"> 9_Test</w:t>
-      </w:r>
-    </w:p>
-    <w:p>
-      <w:pPr>
-        <w:spacing w:after="0" w:line="276" w:lineRule="auto"/>
-        <w:rPr>
-          <w:rFonts w:ascii="Times New Roman" w:hAnsi="Times New Roman" w:cs="Times New Roman"/>
-        </w:rPr>
-      </w:pPr>
-      <w:r>
-        <w:rPr>
-          <w:rFonts w:ascii="Times New Roman" w:hAnsi="Times New Roman" w:cs="Times New Roman"/>
-        </w:rPr>
-        <w:t xml:space="preserve">    </w:t>
-      </w:r>
-      <w:r>
-        <w:rPr>
-          <w:rFonts w:ascii="Segoe UI Symbol" w:hAnsi="Segoe UI Symbol" w:cs="Segoe UI Symbol"/>
-        </w:rPr>
-        <w:t>✔</w:t>
-      </w:r>
-      <w:r>
-        <w:rPr>
-          <w:rFonts w:ascii="Times New Roman" w:hAnsi="Times New Roman" w:cs="Times New Roman"/>
-        </w:rPr>
-        <w:t xml:space="preserve"> 10_Test</w:t>
-      </w:r>
-    </w:p>
-    <w:p>
-      <w:pPr>
-        <w:spacing w:after="0" w:line="276" w:lineRule="auto"/>
-        <w:rPr>
-          <w:rFonts w:ascii="Times New Roman" w:hAnsi="Times New Roman" w:cs="Times New Roman"/>
-        </w:rPr>
-      </w:pPr>
-    </w:p>
-    <w:p>
-      <w:pPr>
-        <w:spacing w:after="0" w:line="276" w:lineRule="auto"/>
-        <w:rPr>
-          <w:rFonts w:ascii="Times New Roman" w:hAnsi="Times New Roman" w:cs="Times New Roman"/>
-        </w:rPr>
-      </w:pPr>
-    </w:p>
-    <w:p>
-      <w:pPr>
-        <w:spacing w:after="0" w:line="276" w:lineRule="auto"/>
-        <w:rPr>
-          <w:rFonts w:ascii="Times New Roman" w:hAnsi="Times New Roman" w:cs="Times New Roman"/>
-        </w:rPr>
-      </w:pPr>
-      <w:r>
-        <w:rPr>
-          <w:rFonts w:ascii="Times New Roman" w:hAnsi="Times New Roman" w:cs="Times New Roman"/>
-        </w:rPr>
-        <w:t xml:space="preserve">  52 passing (3s)</w:t>
-      </w:r>
+        <w:t>File directory:</w:t>
+      </w:r>
+    </w:p>
+    <w:p>
+      <w:pPr>
+        <w:spacing w:after="0" w:line="276" w:lineRule="auto"/>
+        <w:rPr>
+          <w:rFonts w:ascii="Times New Roman" w:hAnsi="Times New Roman" w:cs="Times New Roman"/>
+        </w:rPr>
+      </w:pPr>
+    </w:p>
+    <w:p>
+      <w:pPr>
+        <w:spacing w:after="0" w:line="276" w:lineRule="auto"/>
+        <w:rPr>
+          <w:rFonts w:ascii="Times New Roman" w:hAnsi="Times New Roman" w:cs="Times New Roman"/>
+        </w:rPr>
+      </w:pPr>
+      <w:r>
+        <w:rPr>
+          <w:rFonts w:ascii="Times New Roman" w:hAnsi="Times New Roman" w:cs="Times New Roman"/>
+        </w:rPr>
+        <w:t>&gt; Get-</w:t>
+      </w:r>
+      <w:proofErr w:type="spellStart"/>
+      <w:r>
+        <w:rPr>
+          <w:rFonts w:ascii="Times New Roman" w:hAnsi="Times New Roman" w:cs="Times New Roman"/>
+        </w:rPr>
+        <w:t>ChildItem</w:t>
+      </w:r>
+      <w:proofErr w:type="spellEnd"/>
+      <w:r>
+        <w:rPr>
+          <w:rFonts w:ascii="Times New Roman" w:hAnsi="Times New Roman" w:cs="Times New Roman"/>
+        </w:rPr>
+        <w:t xml:space="preserve"> -Recurse -Force | Where-Object {               </w:t>
+      </w:r>
+    </w:p>
+    <w:p>
+      <w:pPr>
+        <w:spacing w:after="0" w:line="276" w:lineRule="auto"/>
+        <w:rPr>
+          <w:rFonts w:ascii="Times New Roman" w:hAnsi="Times New Roman" w:cs="Times New Roman"/>
+        </w:rPr>
+      </w:pPr>
+      <w:r>
+        <w:rPr>
+          <w:rFonts w:ascii="Times New Roman" w:hAnsi="Times New Roman" w:cs="Times New Roman"/>
+        </w:rPr>
+        <w:t>&gt;&gt;     $</w:t>
+      </w:r>
+      <w:proofErr w:type="gramStart"/>
+      <w:r>
+        <w:rPr>
+          <w:rFonts w:ascii="Times New Roman" w:hAnsi="Times New Roman" w:cs="Times New Roman"/>
+        </w:rPr>
+        <w:t>_.</w:t>
+      </w:r>
+      <w:proofErr w:type="spellStart"/>
+      <w:r>
+        <w:rPr>
+          <w:rFonts w:ascii="Times New Roman" w:hAnsi="Times New Roman" w:cs="Times New Roman"/>
+        </w:rPr>
+        <w:t>FullName</w:t>
+      </w:r>
+      <w:proofErr w:type="spellEnd"/>
+      <w:proofErr w:type="gramEnd"/>
+      <w:r>
+        <w:rPr>
+          <w:rFonts w:ascii="Times New Roman" w:hAnsi="Times New Roman" w:cs="Times New Roman"/>
+        </w:rPr>
+        <w:t xml:space="preserve"> -</w:t>
+      </w:r>
+      <w:proofErr w:type="spellStart"/>
+      <w:r>
+        <w:rPr>
+          <w:rFonts w:ascii="Times New Roman" w:hAnsi="Times New Roman" w:cs="Times New Roman"/>
+        </w:rPr>
+        <w:t>notmatch</w:t>
+      </w:r>
+      <w:proofErr w:type="spellEnd"/>
+      <w:r>
+        <w:rPr>
+          <w:rFonts w:ascii="Times New Roman" w:hAnsi="Times New Roman" w:cs="Times New Roman"/>
+        </w:rPr>
+        <w:t xml:space="preserve"> '\\(</w:t>
+      </w:r>
+      <w:proofErr w:type="spellStart"/>
+      <w:r>
+        <w:rPr>
+          <w:rFonts w:ascii="Times New Roman" w:hAnsi="Times New Roman" w:cs="Times New Roman"/>
+        </w:rPr>
+        <w:t>node_modules</w:t>
+      </w:r>
+      <w:proofErr w:type="spellEnd"/>
+      <w:r>
+        <w:rPr>
+          <w:rFonts w:ascii="Times New Roman" w:hAnsi="Times New Roman" w:cs="Times New Roman"/>
+        </w:rPr>
+        <w:t>|</w:t>
+      </w:r>
+      <w:proofErr w:type="gramStart"/>
+      <w:r>
+        <w:rPr>
+          <w:rFonts w:ascii="Times New Roman" w:hAnsi="Times New Roman" w:cs="Times New Roman"/>
+        </w:rPr>
+        <w:t>\.git)(</w:t>
+      </w:r>
+      <w:proofErr w:type="gramEnd"/>
+      <w:r>
+        <w:rPr>
+          <w:rFonts w:ascii="Times New Roman" w:hAnsi="Times New Roman" w:cs="Times New Roman"/>
+        </w:rPr>
+        <w:t xml:space="preserve">\\|$)'                           </w:t>
+      </w:r>
+    </w:p>
+    <w:p>
+      <w:pPr>
+        <w:spacing w:after="0" w:line="276" w:lineRule="auto"/>
+        <w:rPr>
+          <w:rFonts w:ascii="Times New Roman" w:hAnsi="Times New Roman" w:cs="Times New Roman"/>
+        </w:rPr>
+      </w:pPr>
+      <w:r>
+        <w:rPr>
+          <w:rFonts w:ascii="Times New Roman" w:hAnsi="Times New Roman" w:cs="Times New Roman"/>
+        </w:rPr>
+        <w:t xml:space="preserve">&gt;&gt; }                           </w:t>
+      </w:r>
+    </w:p>
+    <w:p>
+      <w:pPr>
+        <w:spacing w:after="0" w:line="276" w:lineRule="auto"/>
+        <w:rPr>
+          <w:rFonts w:ascii="Times New Roman" w:hAnsi="Times New Roman" w:cs="Times New Roman"/>
+        </w:rPr>
+      </w:pPr>
+      <w:r>
+        <w:rPr>
+          <w:rFonts w:ascii="Times New Roman" w:hAnsi="Times New Roman" w:cs="Times New Roman"/>
+        </w:rPr>
+        <w:t xml:space="preserve">                                                                            </w:t>
+      </w:r>
+    </w:p>
+    <w:p>
+      <w:pPr>
+        <w:spacing w:after="0" w:line="276" w:lineRule="auto"/>
+        <w:rPr>
+          <w:rFonts w:ascii="Times New Roman" w:hAnsi="Times New Roman" w:cs="Times New Roman"/>
+        </w:rPr>
+      </w:pPr>
+      <w:r>
+        <w:rPr>
+          <w:rFonts w:ascii="Times New Roman" w:hAnsi="Times New Roman" w:cs="Times New Roman"/>
+        </w:rPr>
+        <w:t xml:space="preserve">                             </w:t>
+      </w:r>
+    </w:p>
+    <w:p>
+      <w:pPr>
+        <w:spacing w:after="0" w:line="276" w:lineRule="auto"/>
+        <w:rPr>
+          <w:rFonts w:ascii="Times New Roman" w:hAnsi="Times New Roman" w:cs="Times New Roman"/>
+        </w:rPr>
+      </w:pPr>
+      <w:r>
+        <w:rPr>
+          <w:rFonts w:ascii="Times New Roman" w:hAnsi="Times New Roman" w:cs="Times New Roman"/>
+        </w:rPr>
+        <w:t xml:space="preserve">    Directory: D:\Users\DELL\new-onedrive\OneDrive - Institute of Business </w:t>
+      </w:r>
+    </w:p>
+    <w:p>
+      <w:pPr>
+        <w:spacing w:after="0" w:line="276" w:lineRule="auto"/>
+        <w:rPr>
+          <w:rFonts w:ascii="Times New Roman" w:hAnsi="Times New Roman" w:cs="Times New Roman"/>
+        </w:rPr>
+      </w:pPr>
+      <w:r>
+        <w:rPr>
+          <w:rFonts w:ascii="Times New Roman" w:hAnsi="Times New Roman" w:cs="Times New Roman"/>
+        </w:rPr>
+        <w:t xml:space="preserve">    Administration\iba\sem8\blockchain\CSE355_Introduction-to-Blockchain\programming_assignments\PA2</w:t>
+      </w:r>
+    </w:p>
+    <w:p>
+      <w:pPr>
+        <w:spacing w:after="0" w:line="276" w:lineRule="auto"/>
+        <w:rPr>
+          <w:rFonts w:ascii="Times New Roman" w:hAnsi="Times New Roman" w:cs="Times New Roman"/>
+        </w:rPr>
+      </w:pPr>
+    </w:p>
+    <w:p>
+      <w:pPr>
+        <w:spacing w:after="0" w:line="276" w:lineRule="auto"/>
+        <w:rPr>
+          <w:rFonts w:ascii="Times New Roman" w:hAnsi="Times New Roman" w:cs="Times New Roman"/>
+        </w:rPr>
+      </w:pPr>
+    </w:p>
+    <w:p>
+      <w:pPr>
+        <w:spacing w:after="0" w:line="276" w:lineRule="auto"/>
+        <w:rPr>
+          <w:rFonts w:ascii="Times New Roman" w:hAnsi="Times New Roman" w:cs="Times New Roman"/>
+        </w:rPr>
+      </w:pPr>
+      <w:r>
+        <w:rPr>
+          <w:rFonts w:ascii="Times New Roman" w:hAnsi="Times New Roman" w:cs="Times New Roman"/>
+        </w:rPr>
+        <w:t xml:space="preserve">Mode                 </w:t>
+      </w:r>
+      <w:proofErr w:type="spellStart"/>
+      <w:r>
+        <w:rPr>
+          <w:rFonts w:ascii="Times New Roman" w:hAnsi="Times New Roman" w:cs="Times New Roman"/>
+        </w:rPr>
+        <w:t>LastWriteTime</w:t>
+      </w:r>
+      <w:proofErr w:type="spellEnd"/>
+      <w:r>
+        <w:rPr>
+          <w:rFonts w:ascii="Times New Roman" w:hAnsi="Times New Roman" w:cs="Times New Roman"/>
+        </w:rPr>
+        <w:t xml:space="preserve">         Length Name                                                                                                         </w:t>
+      </w:r>
+    </w:p>
+    <w:p>
+      <w:pPr>
+        <w:spacing w:after="0" w:line="276" w:lineRule="auto"/>
+        <w:rPr>
+          <w:rFonts w:ascii="Times New Roman" w:hAnsi="Times New Roman" w:cs="Times New Roman"/>
+        </w:rPr>
+      </w:pPr>
+      <w:r>
+        <w:rPr>
+          <w:rFonts w:ascii="Times New Roman" w:hAnsi="Times New Roman" w:cs="Times New Roman"/>
+        </w:rPr>
+        <w:t xml:space="preserve">----                 ------------- </w:t>
+      </w:r>
+      <w:proofErr w:type="gramStart"/>
+      <w:r>
+        <w:rPr>
+          <w:rFonts w:ascii="Times New Roman" w:hAnsi="Times New Roman" w:cs="Times New Roman"/>
+        </w:rPr>
+        <w:t xml:space="preserve">        </w:t>
+      </w:r>
+      <w:proofErr w:type="gramEnd"/>
+      <w:r>
+        <w:rPr>
+          <w:rFonts w:ascii="Times New Roman" w:hAnsi="Times New Roman" w:cs="Times New Roman"/>
+        </w:rPr>
+        <w:t xml:space="preserve">------ ----                                                                                                         </w:t>
+      </w:r>
+    </w:p>
+    <w:p>
+      <w:pPr>
+        <w:spacing w:after="0" w:line="276" w:lineRule="auto"/>
+        <w:rPr>
+          <w:rFonts w:ascii="Times New Roman" w:hAnsi="Times New Roman" w:cs="Times New Roman"/>
+        </w:rPr>
+      </w:pPr>
+      <w:r>
+        <w:rPr>
+          <w:rFonts w:ascii="Times New Roman" w:hAnsi="Times New Roman" w:cs="Times New Roman"/>
+        </w:rPr>
+        <w:t>d-----         03-May-</w:t>
+      </w:r>
+      <w:proofErr w:type="gramStart"/>
+      <w:r>
+        <w:rPr>
+          <w:rFonts w:ascii="Times New Roman" w:hAnsi="Times New Roman" w:cs="Times New Roman"/>
+        </w:rPr>
+        <w:t>26  09:37</w:t>
+      </w:r>
+      <w:proofErr w:type="gramEnd"/>
+      <w:r>
+        <w:rPr>
+          <w:rFonts w:ascii="Times New Roman" w:hAnsi="Times New Roman" w:cs="Times New Roman"/>
+        </w:rPr>
+        <w:t xml:space="preserve"> PM                artifacts                                                                                                    </w:t>
+      </w:r>
+    </w:p>
+    <w:p>
+      <w:pPr>
+        <w:spacing w:after="0" w:line="276" w:lineRule="auto"/>
+        <w:rPr>
+          <w:rFonts w:ascii="Times New Roman" w:hAnsi="Times New Roman" w:cs="Times New Roman"/>
+        </w:rPr>
+      </w:pPr>
+      <w:proofErr w:type="gramStart"/>
+      <w:r>
+        <w:rPr>
+          <w:rFonts w:ascii="Times New Roman" w:hAnsi="Times New Roman" w:cs="Times New Roman"/>
+        </w:rPr>
+        <w:t>d---</w:t>
+      </w:r>
+      <w:proofErr w:type="gramEnd"/>
+      <w:r>
+        <w:rPr>
+          <w:rFonts w:ascii="Times New Roman" w:hAnsi="Times New Roman" w:cs="Times New Roman"/>
+        </w:rPr>
+        <w:t>--         03-May-</w:t>
+      </w:r>
+      <w:proofErr w:type="gramStart"/>
+      <w:r>
+        <w:rPr>
+          <w:rFonts w:ascii="Times New Roman" w:hAnsi="Times New Roman" w:cs="Times New Roman"/>
+        </w:rPr>
+        <w:t>26  09:37</w:t>
+      </w:r>
+      <w:proofErr w:type="gramEnd"/>
+      <w:r>
+        <w:rPr>
+          <w:rFonts w:ascii="Times New Roman" w:hAnsi="Times New Roman" w:cs="Times New Roman"/>
+        </w:rPr>
+        <w:t xml:space="preserve"> PM                cache                                                                                                        </w:t>
+      </w:r>
+    </w:p>
+    <w:p>
+      <w:pPr>
+        <w:spacing w:after="0" w:line="276" w:lineRule="auto"/>
+        <w:rPr>
+          <w:rFonts w:ascii="Times New Roman" w:hAnsi="Times New Roman" w:cs="Times New Roman"/>
+        </w:rPr>
+      </w:pPr>
+      <w:proofErr w:type="spellStart"/>
+      <w:proofErr w:type="gramStart"/>
+      <w:r>
+        <w:rPr>
+          <w:rFonts w:ascii="Times New Roman" w:hAnsi="Times New Roman" w:cs="Times New Roman"/>
+        </w:rPr>
+        <w:t>dar</w:t>
+      </w:r>
+      <w:proofErr w:type="spellEnd"/>
+      <w:r>
+        <w:rPr>
+          <w:rFonts w:ascii="Times New Roman" w:hAnsi="Times New Roman" w:cs="Times New Roman"/>
+        </w:rPr>
+        <w:t>-</w:t>
+      </w:r>
+      <w:proofErr w:type="gramEnd"/>
+      <w:r>
+        <w:rPr>
+          <w:rFonts w:ascii="Times New Roman" w:hAnsi="Times New Roman" w:cs="Times New Roman"/>
+        </w:rPr>
+        <w:t>-l         03-May-</w:t>
+      </w:r>
+      <w:proofErr w:type="gramStart"/>
+      <w:r>
+        <w:rPr>
+          <w:rFonts w:ascii="Times New Roman" w:hAnsi="Times New Roman" w:cs="Times New Roman"/>
+        </w:rPr>
+        <w:t>26  09:29</w:t>
+      </w:r>
+      <w:proofErr w:type="gramEnd"/>
+      <w:r>
+        <w:rPr>
+          <w:rFonts w:ascii="Times New Roman" w:hAnsi="Times New Roman" w:cs="Times New Roman"/>
+        </w:rPr>
+        <w:t xml:space="preserve"> PM                contracts                                                                                                    </w:t>
+      </w:r>
+    </w:p>
+    <w:p>
+      <w:pPr>
+        <w:spacing w:after="0" w:line="276" w:lineRule="auto"/>
+        <w:rPr>
+          <w:rFonts w:ascii="Times New Roman" w:hAnsi="Times New Roman" w:cs="Times New Roman"/>
+        </w:rPr>
+      </w:pPr>
+      <w:r>
+        <w:rPr>
+          <w:rFonts w:ascii="Times New Roman" w:hAnsi="Times New Roman" w:cs="Times New Roman"/>
+        </w:rPr>
+        <w:t>d-----         03-May-</w:t>
+      </w:r>
+      <w:proofErr w:type="gramStart"/>
+      <w:r>
+        <w:rPr>
+          <w:rFonts w:ascii="Times New Roman" w:hAnsi="Times New Roman" w:cs="Times New Roman"/>
+        </w:rPr>
+        <w:t>26  09:29</w:t>
+      </w:r>
+      <w:proofErr w:type="gramEnd"/>
+      <w:r>
+        <w:rPr>
+          <w:rFonts w:ascii="Times New Roman" w:hAnsi="Times New Roman" w:cs="Times New Roman"/>
+        </w:rPr>
+        <w:t xml:space="preserve"> PM                ignition                                                                                                     </w:t>
+      </w:r>
+    </w:p>
+    <w:p>
+      <w:pPr>
+        <w:spacing w:after="0" w:line="276" w:lineRule="auto"/>
+        <w:rPr>
+          <w:rFonts w:ascii="Times New Roman" w:hAnsi="Times New Roman" w:cs="Times New Roman"/>
+        </w:rPr>
+      </w:pPr>
+      <w:r>
+        <w:rPr>
+          <w:rFonts w:ascii="Times New Roman" w:hAnsi="Times New Roman" w:cs="Times New Roman"/>
+        </w:rPr>
+        <w:t>d----l         03-May-</w:t>
+      </w:r>
+      <w:proofErr w:type="gramStart"/>
+      <w:r>
+        <w:rPr>
+          <w:rFonts w:ascii="Times New Roman" w:hAnsi="Times New Roman" w:cs="Times New Roman"/>
+        </w:rPr>
+        <w:t>26  09:21</w:t>
+      </w:r>
+      <w:proofErr w:type="gramEnd"/>
+      <w:r>
+        <w:rPr>
+          <w:rFonts w:ascii="Times New Roman" w:hAnsi="Times New Roman" w:cs="Times New Roman"/>
+        </w:rPr>
+        <w:t xml:space="preserve"> PM                Solidity Test Files                                                                                          </w:t>
+      </w:r>
+    </w:p>
+    <w:p>
+      <w:pPr>
+        <w:spacing w:after="0" w:line="276" w:lineRule="auto"/>
+        <w:rPr>
+          <w:rFonts w:ascii="Times New Roman" w:hAnsi="Times New Roman" w:cs="Times New Roman"/>
+        </w:rPr>
+      </w:pPr>
+      <w:proofErr w:type="spellStart"/>
+      <w:proofErr w:type="gramStart"/>
+      <w:r>
+        <w:rPr>
+          <w:rFonts w:ascii="Times New Roman" w:hAnsi="Times New Roman" w:cs="Times New Roman"/>
+        </w:rPr>
+        <w:t>dar</w:t>
+      </w:r>
+      <w:proofErr w:type="spellEnd"/>
+      <w:r>
+        <w:rPr>
+          <w:rFonts w:ascii="Times New Roman" w:hAnsi="Times New Roman" w:cs="Times New Roman"/>
+        </w:rPr>
+        <w:t xml:space="preserve">--l        </w:t>
+      </w:r>
+      <w:proofErr w:type="gramEnd"/>
+      <w:r>
+        <w:rPr>
+          <w:rFonts w:ascii="Times New Roman" w:hAnsi="Times New Roman" w:cs="Times New Roman"/>
+        </w:rPr>
+        <w:t xml:space="preserve"> 03-May-</w:t>
+      </w:r>
+      <w:proofErr w:type="gramStart"/>
+      <w:r>
+        <w:rPr>
+          <w:rFonts w:ascii="Times New Roman" w:hAnsi="Times New Roman" w:cs="Times New Roman"/>
+        </w:rPr>
+        <w:t>26  09:29</w:t>
+      </w:r>
+      <w:proofErr w:type="gramEnd"/>
+      <w:r>
+        <w:rPr>
+          <w:rFonts w:ascii="Times New Roman" w:hAnsi="Times New Roman" w:cs="Times New Roman"/>
+        </w:rPr>
+        <w:t xml:space="preserve"> PM                test                                                                                                         </w:t>
+      </w:r>
+    </w:p>
+    <w:p>
+      <w:pPr>
+        <w:spacing w:after="0" w:line="276" w:lineRule="auto"/>
+        <w:rPr>
+          <w:rFonts w:ascii="Times New Roman" w:hAnsi="Times New Roman" w:cs="Times New Roman"/>
+        </w:rPr>
+      </w:pPr>
+      <w:r>
+        <w:rPr>
+          <w:rFonts w:ascii="Times New Roman" w:hAnsi="Times New Roman" w:cs="Times New Roman"/>
+        </w:rPr>
+        <w:t>-a----         03-May-</w:t>
+      </w:r>
+      <w:proofErr w:type="gramStart"/>
+      <w:r>
+        <w:rPr>
+          <w:rFonts w:ascii="Times New Roman" w:hAnsi="Times New Roman" w:cs="Times New Roman"/>
+        </w:rPr>
+        <w:t>26  09:29</w:t>
+      </w:r>
+      <w:proofErr w:type="gramEnd"/>
+      <w:r>
+        <w:rPr>
+          <w:rFonts w:ascii="Times New Roman" w:hAnsi="Times New Roman" w:cs="Times New Roman"/>
+        </w:rPr>
+        <w:t xml:space="preserve"> PM            </w:t>
+      </w:r>
+      <w:proofErr w:type="gramStart"/>
+      <w:r>
+        <w:rPr>
+          <w:rFonts w:ascii="Times New Roman" w:hAnsi="Times New Roman" w:cs="Times New Roman"/>
+        </w:rPr>
+        <w:t>270 .</w:t>
+      </w:r>
+      <w:proofErr w:type="spellStart"/>
+      <w:r>
+        <w:rPr>
+          <w:rFonts w:ascii="Times New Roman" w:hAnsi="Times New Roman" w:cs="Times New Roman"/>
+        </w:rPr>
+        <w:t>gitignore</w:t>
+      </w:r>
+      <w:proofErr w:type="spellEnd"/>
+      <w:proofErr w:type="gramEnd"/>
+      <w:r>
+        <w:rPr>
+          <w:rFonts w:ascii="Times New Roman" w:hAnsi="Times New Roman" w:cs="Times New Roman"/>
+        </w:rPr>
+        <w:t xml:space="preserve">                                                                                                   </w:t>
+      </w:r>
+    </w:p>
+    <w:p>
+      <w:pPr>
+        <w:spacing w:after="0" w:line="276" w:lineRule="auto"/>
+        <w:rPr>
+          <w:rFonts w:ascii="Times New Roman" w:hAnsi="Times New Roman" w:cs="Times New Roman"/>
+        </w:rPr>
+      </w:pPr>
+      <w:r>
+        <w:rPr>
+          <w:rFonts w:ascii="Times New Roman" w:hAnsi="Times New Roman" w:cs="Times New Roman"/>
+        </w:rPr>
+        <w:t>-a---l         03-May-</w:t>
+      </w:r>
+      <w:proofErr w:type="gramStart"/>
+      <w:r>
+        <w:rPr>
+          <w:rFonts w:ascii="Times New Roman" w:hAnsi="Times New Roman" w:cs="Times New Roman"/>
+        </w:rPr>
+        <w:t>26  08:52</w:t>
+      </w:r>
+      <w:proofErr w:type="gramEnd"/>
+      <w:r>
+        <w:rPr>
+          <w:rFonts w:ascii="Times New Roman" w:hAnsi="Times New Roman" w:cs="Times New Roman"/>
+        </w:rPr>
+        <w:t xml:space="preserve"> PM           5576 </w:t>
+      </w:r>
+      <w:proofErr w:type="spellStart"/>
+      <w:r>
+        <w:rPr>
+          <w:rFonts w:ascii="Times New Roman" w:hAnsi="Times New Roman" w:cs="Times New Roman"/>
+        </w:rPr>
+        <w:t>banking_xxxxx_contract.sol</w:t>
+      </w:r>
+      <w:proofErr w:type="spellEnd"/>
+      <w:r>
+        <w:rPr>
+          <w:rFonts w:ascii="Times New Roman" w:hAnsi="Times New Roman" w:cs="Times New Roman"/>
+        </w:rPr>
+        <w:t xml:space="preserve">                                                                                   </w:t>
+      </w:r>
+    </w:p>
+    <w:p>
+      <w:pPr>
+        <w:spacing w:after="0" w:line="276" w:lineRule="auto"/>
+        <w:rPr>
+          <w:rFonts w:ascii="Times New Roman" w:hAnsi="Times New Roman" w:cs="Times New Roman"/>
+        </w:rPr>
+      </w:pPr>
+      <w:r>
+        <w:rPr>
+          <w:rFonts w:ascii="Times New Roman" w:hAnsi="Times New Roman" w:cs="Times New Roman"/>
+        </w:rPr>
+        <w:t>-a---l         03-May-</w:t>
+      </w:r>
+      <w:proofErr w:type="gramStart"/>
+      <w:r>
+        <w:rPr>
+          <w:rFonts w:ascii="Times New Roman" w:hAnsi="Times New Roman" w:cs="Times New Roman"/>
+        </w:rPr>
+        <w:t>26  09:20</w:t>
+      </w:r>
+      <w:proofErr w:type="gramEnd"/>
+      <w:r>
+        <w:rPr>
+          <w:rFonts w:ascii="Times New Roman" w:hAnsi="Times New Roman" w:cs="Times New Roman"/>
+        </w:rPr>
+        <w:t xml:space="preserve"> PM        3199016 CSE355_Spring26_PA2.pdf                                                                                      </w:t>
+      </w:r>
+    </w:p>
+    <w:p>
+      <w:pPr>
+        <w:spacing w:after="0" w:line="276" w:lineRule="auto"/>
+        <w:rPr>
+          <w:rFonts w:ascii="Times New Roman" w:hAnsi="Times New Roman" w:cs="Times New Roman"/>
+        </w:rPr>
+      </w:pPr>
+      <w:r>
+        <w:rPr>
+          <w:rFonts w:ascii="Times New Roman" w:hAnsi="Times New Roman" w:cs="Times New Roman"/>
+        </w:rPr>
+        <w:t>-a---l         03-May-</w:t>
+      </w:r>
+      <w:proofErr w:type="gramStart"/>
+      <w:r>
+        <w:rPr>
+          <w:rFonts w:ascii="Times New Roman" w:hAnsi="Times New Roman" w:cs="Times New Roman"/>
+        </w:rPr>
+        <w:t>26  08:52</w:t>
+      </w:r>
+      <w:proofErr w:type="gramEnd"/>
+      <w:r>
+        <w:rPr>
+          <w:rFonts w:ascii="Times New Roman" w:hAnsi="Times New Roman" w:cs="Times New Roman"/>
+        </w:rPr>
+        <w:t xml:space="preserve"> PM           1744 grader.py                                                                                                    </w:t>
+      </w:r>
+    </w:p>
+    <w:p>
+      <w:pPr>
+        <w:spacing w:after="0" w:line="276" w:lineRule="auto"/>
+        <w:rPr>
+          <w:rFonts w:ascii="Times New Roman" w:hAnsi="Times New Roman" w:cs="Times New Roman"/>
+        </w:rPr>
+      </w:pPr>
+      <w:r>
+        <w:rPr>
+          <w:rFonts w:ascii="Times New Roman" w:hAnsi="Times New Roman" w:cs="Times New Roman"/>
+        </w:rPr>
+        <w:t>-a----         03-May-</w:t>
+      </w:r>
+      <w:proofErr w:type="gramStart"/>
+      <w:r>
+        <w:rPr>
+          <w:rFonts w:ascii="Times New Roman" w:hAnsi="Times New Roman" w:cs="Times New Roman"/>
+        </w:rPr>
+        <w:t>26  09:27</w:t>
+      </w:r>
+      <w:proofErr w:type="gramEnd"/>
+      <w:r>
+        <w:rPr>
+          <w:rFonts w:ascii="Times New Roman" w:hAnsi="Times New Roman" w:cs="Times New Roman"/>
+        </w:rPr>
+        <w:t xml:space="preserve"> PM            146 hardhat.config.js                                                                                            </w:t>
+      </w:r>
+    </w:p>
+    <w:p>
+      <w:pPr>
+        <w:spacing w:after="0" w:line="276" w:lineRule="auto"/>
+        <w:rPr>
+          <w:rFonts w:ascii="Times New Roman" w:hAnsi="Times New Roman" w:cs="Times New Roman"/>
+        </w:rPr>
+      </w:pPr>
+      <w:r>
+        <w:rPr>
+          <w:rFonts w:ascii="Times New Roman" w:hAnsi="Times New Roman" w:cs="Times New Roman"/>
+        </w:rPr>
+        <w:t>-a----         03-May-</w:t>
+      </w:r>
+      <w:proofErr w:type="gramStart"/>
+      <w:r>
+        <w:rPr>
+          <w:rFonts w:ascii="Times New Roman" w:hAnsi="Times New Roman" w:cs="Times New Roman"/>
+        </w:rPr>
+        <w:t>26  09:45</w:t>
+      </w:r>
+      <w:proofErr w:type="gramEnd"/>
+      <w:r>
+        <w:rPr>
+          <w:rFonts w:ascii="Times New Roman" w:hAnsi="Times New Roman" w:cs="Times New Roman"/>
+        </w:rPr>
+        <w:t xml:space="preserve"> PM          15449 PA1_zuha_aqib_26106.docx                                                                                     </w:t>
+      </w:r>
+    </w:p>
+    <w:p>
+      <w:pPr>
+        <w:spacing w:after="0" w:line="276" w:lineRule="auto"/>
+        <w:rPr>
+          <w:rFonts w:ascii="Times New Roman" w:hAnsi="Times New Roman" w:cs="Times New Roman"/>
+        </w:rPr>
+      </w:pPr>
+      <w:r>
+        <w:rPr>
+          <w:rFonts w:ascii="Times New Roman" w:hAnsi="Times New Roman" w:cs="Times New Roman"/>
+        </w:rPr>
+        <w:t>-a----         03-May-</w:t>
+      </w:r>
+      <w:proofErr w:type="gramStart"/>
+      <w:r>
+        <w:rPr>
+          <w:rFonts w:ascii="Times New Roman" w:hAnsi="Times New Roman" w:cs="Times New Roman"/>
+        </w:rPr>
+        <w:t>26  09:46</w:t>
+      </w:r>
+      <w:proofErr w:type="gramEnd"/>
+      <w:r>
+        <w:rPr>
+          <w:rFonts w:ascii="Times New Roman" w:hAnsi="Times New Roman" w:cs="Times New Roman"/>
+        </w:rPr>
+        <w:t xml:space="preserve"> PM          94554 PA1_zuha_aqib_26106.pdf                                                                                      </w:t>
+      </w:r>
+    </w:p>
+    <w:p>
+      <w:pPr>
+        <w:spacing w:after="0" w:line="276" w:lineRule="auto"/>
+        <w:rPr>
+          <w:rFonts w:ascii="Times New Roman" w:hAnsi="Times New Roman" w:cs="Times New Roman"/>
+        </w:rPr>
+      </w:pPr>
+      <w:r>
+        <w:rPr>
+          <w:rFonts w:ascii="Times New Roman" w:hAnsi="Times New Roman" w:cs="Times New Roman"/>
+        </w:rPr>
+        <w:t>-a----         03-May-</w:t>
+      </w:r>
+      <w:proofErr w:type="gramStart"/>
+      <w:r>
+        <w:rPr>
+          <w:rFonts w:ascii="Times New Roman" w:hAnsi="Times New Roman" w:cs="Times New Roman"/>
+        </w:rPr>
+        <w:t>26  09:35</w:t>
+      </w:r>
+      <w:proofErr w:type="gramEnd"/>
+      <w:r>
+        <w:rPr>
+          <w:rFonts w:ascii="Times New Roman" w:hAnsi="Times New Roman" w:cs="Times New Roman"/>
+        </w:rPr>
+        <w:t xml:space="preserve"> PM         275047 package-</w:t>
+      </w:r>
+      <w:proofErr w:type="spellStart"/>
+      <w:proofErr w:type="gramStart"/>
+      <w:r>
+        <w:rPr>
+          <w:rFonts w:ascii="Times New Roman" w:hAnsi="Times New Roman" w:cs="Times New Roman"/>
+        </w:rPr>
+        <w:t>lock.json</w:t>
+      </w:r>
+      <w:proofErr w:type="spellEnd"/>
+      <w:proofErr w:type="gramEnd"/>
+      <w:r>
+        <w:rPr>
+          <w:rFonts w:ascii="Times New Roman" w:hAnsi="Times New Roman" w:cs="Times New Roman"/>
+        </w:rPr>
+        <w:t xml:space="preserve">                                                                                            </w:t>
+      </w:r>
+    </w:p>
+    <w:p>
+      <w:pPr>
+        <w:spacing w:after="0" w:line="276" w:lineRule="auto"/>
+        <w:rPr>
+          <w:rFonts w:ascii="Times New Roman" w:hAnsi="Times New Roman" w:cs="Times New Roman"/>
+        </w:rPr>
+      </w:pPr>
+      <w:r>
+        <w:rPr>
+          <w:rFonts w:ascii="Times New Roman" w:hAnsi="Times New Roman" w:cs="Times New Roman"/>
+        </w:rPr>
+        <w:t>-a----         03-May-</w:t>
+      </w:r>
+      <w:proofErr w:type="gramStart"/>
+      <w:r>
+        <w:rPr>
+          <w:rFonts w:ascii="Times New Roman" w:hAnsi="Times New Roman" w:cs="Times New Roman"/>
+        </w:rPr>
+        <w:t>26  09:35</w:t>
+      </w:r>
+      <w:proofErr w:type="gramEnd"/>
+      <w:r>
+        <w:rPr>
+          <w:rFonts w:ascii="Times New Roman" w:hAnsi="Times New Roman" w:cs="Times New Roman"/>
+        </w:rPr>
+        <w:t xml:space="preserve"> PM            385 </w:t>
+      </w:r>
+      <w:proofErr w:type="spellStart"/>
+      <w:proofErr w:type="gramStart"/>
+      <w:r>
+        <w:rPr>
+          <w:rFonts w:ascii="Times New Roman" w:hAnsi="Times New Roman" w:cs="Times New Roman"/>
+        </w:rPr>
+        <w:t>package.json</w:t>
+      </w:r>
+      <w:proofErr w:type="spellEnd"/>
+      <w:proofErr w:type="gramEnd"/>
+      <w:r>
+        <w:rPr>
+          <w:rFonts w:ascii="Times New Roman" w:hAnsi="Times New Roman" w:cs="Times New Roman"/>
+        </w:rPr>
+        <w:t xml:space="preserve">                                                                                                 </w:t>
+      </w:r>
+    </w:p>
+    <w:p>
+      <w:pPr>
+        <w:spacing w:after="0" w:line="276" w:lineRule="auto"/>
+        <w:rPr>
+          <w:rFonts w:ascii="Times New Roman" w:hAnsi="Times New Roman" w:cs="Times New Roman"/>
+        </w:rPr>
+      </w:pPr>
+      <w:r>
+        <w:rPr>
+          <w:rFonts w:ascii="Times New Roman" w:hAnsi="Times New Roman" w:cs="Times New Roman"/>
+        </w:rPr>
+        <w:t>-a----         03-May-</w:t>
+      </w:r>
+      <w:proofErr w:type="gramStart"/>
+      <w:r>
+        <w:rPr>
+          <w:rFonts w:ascii="Times New Roman" w:hAnsi="Times New Roman" w:cs="Times New Roman"/>
+        </w:rPr>
+        <w:t>26  09:27</w:t>
+      </w:r>
+      <w:proofErr w:type="gramEnd"/>
+      <w:r>
+        <w:rPr>
+          <w:rFonts w:ascii="Times New Roman" w:hAnsi="Times New Roman" w:cs="Times New Roman"/>
+        </w:rPr>
+        <w:t xml:space="preserve"> PM            390 README.md                                                                                                    </w:t>
+      </w:r>
+    </w:p>
+    <w:p>
+      <w:pPr>
+        <w:spacing w:after="0" w:line="276" w:lineRule="auto"/>
+        <w:rPr>
+          <w:rFonts w:ascii="Times New Roman" w:hAnsi="Times New Roman" w:cs="Times New Roman"/>
+        </w:rPr>
+      </w:pPr>
+    </w:p>
+    <w:p>
+      <w:pPr>
+        <w:spacing w:after="0" w:line="276" w:lineRule="auto"/>
+        <w:rPr>
+          <w:rFonts w:ascii="Times New Roman" w:hAnsi="Times New Roman" w:cs="Times New Roman"/>
+        </w:rPr>
+      </w:pPr>
+    </w:p>
+    <w:p>
+      <w:pPr>
+        <w:spacing w:after="0" w:line="276" w:lineRule="auto"/>
+        <w:rPr>
+          <w:rFonts w:ascii="Times New Roman" w:hAnsi="Times New Roman" w:cs="Times New Roman"/>
+        </w:rPr>
+      </w:pPr>
+      <w:r>
+        <w:rPr>
+          <w:rFonts w:ascii="Times New Roman" w:hAnsi="Times New Roman" w:cs="Times New Roman"/>
+        </w:rPr>
+        <w:t xml:space="preserve">    Directory: D:\Users\DELL\new-onedrive\OneDrive - Institute of Business </w:t>
+      </w:r>
+    </w:p>
+    <w:p>
+      <w:pPr>
+        <w:spacing w:after="0" w:line="276" w:lineRule="auto"/>
+        <w:rPr>
+          <w:rFonts w:ascii="Times New Roman" w:hAnsi="Times New Roman" w:cs="Times New Roman"/>
+        </w:rPr>
+      </w:pPr>
+      <w:r>
+        <w:rPr>
+          <w:rFonts w:ascii="Times New Roman" w:hAnsi="Times New Roman" w:cs="Times New Roman"/>
+        </w:rPr>
+        <w:t xml:space="preserve">    Administration\iba\sem8\blockchain\CSE355_Introduction-to-Blockchain\programming_assignments\PA2\artifacts</w:t>
+      </w:r>
+    </w:p>
+    <w:p>
+      <w:pPr>
+        <w:spacing w:after="0" w:line="276" w:lineRule="auto"/>
+        <w:rPr>
+          <w:rFonts w:ascii="Times New Roman" w:hAnsi="Times New Roman" w:cs="Times New Roman"/>
+        </w:rPr>
+      </w:pPr>
+    </w:p>
+    <w:p>
+      <w:pPr>
+        <w:spacing w:after="0" w:line="276" w:lineRule="auto"/>
+        <w:rPr>
+          <w:rFonts w:ascii="Times New Roman" w:hAnsi="Times New Roman" w:cs="Times New Roman"/>
+        </w:rPr>
+      </w:pPr>
+    </w:p>
+    <w:p>
+      <w:pPr>
+        <w:spacing w:after="0" w:line="276" w:lineRule="auto"/>
+        <w:rPr>
+          <w:rFonts w:ascii="Times New Roman" w:hAnsi="Times New Roman" w:cs="Times New Roman"/>
+        </w:rPr>
+      </w:pPr>
+      <w:r>
+        <w:rPr>
+          <w:rFonts w:ascii="Times New Roman" w:hAnsi="Times New Roman" w:cs="Times New Roman"/>
+        </w:rPr>
+        <w:t xml:space="preserve">Mode                 </w:t>
+      </w:r>
+      <w:proofErr w:type="spellStart"/>
+      <w:r>
+        <w:rPr>
+          <w:rFonts w:ascii="Times New Roman" w:hAnsi="Times New Roman" w:cs="Times New Roman"/>
+        </w:rPr>
+        <w:t>LastWriteTime</w:t>
+      </w:r>
+      <w:proofErr w:type="spellEnd"/>
+      <w:r>
+        <w:rPr>
+          <w:rFonts w:ascii="Times New Roman" w:hAnsi="Times New Roman" w:cs="Times New Roman"/>
+        </w:rPr>
+        <w:t xml:space="preserve">         Length Name                                                                                                         </w:t>
+      </w:r>
+    </w:p>
+    <w:p>
+      <w:pPr>
+        <w:spacing w:after="0" w:line="276" w:lineRule="auto"/>
+        <w:rPr>
+          <w:rFonts w:ascii="Times New Roman" w:hAnsi="Times New Roman" w:cs="Times New Roman"/>
+        </w:rPr>
+      </w:pPr>
+      <w:r>
+        <w:rPr>
+          <w:rFonts w:ascii="Times New Roman" w:hAnsi="Times New Roman" w:cs="Times New Roman"/>
+        </w:rPr>
+        <w:t xml:space="preserve">----                 ------------- </w:t>
+      </w:r>
+      <w:proofErr w:type="gramStart"/>
+      <w:r>
+        <w:rPr>
+          <w:rFonts w:ascii="Times New Roman" w:hAnsi="Times New Roman" w:cs="Times New Roman"/>
+        </w:rPr>
+        <w:t xml:space="preserve">        </w:t>
+      </w:r>
+      <w:proofErr w:type="gramEnd"/>
+      <w:r>
+        <w:rPr>
+          <w:rFonts w:ascii="Times New Roman" w:hAnsi="Times New Roman" w:cs="Times New Roman"/>
+        </w:rPr>
+        <w:t xml:space="preserve">------ ----                                                                                                         </w:t>
+      </w:r>
+    </w:p>
+    <w:p>
+      <w:pPr>
+        <w:spacing w:after="0" w:line="276" w:lineRule="auto"/>
+        <w:rPr>
+          <w:rFonts w:ascii="Times New Roman" w:hAnsi="Times New Roman" w:cs="Times New Roman"/>
+        </w:rPr>
+      </w:pPr>
+      <w:proofErr w:type="gramStart"/>
+      <w:r>
+        <w:rPr>
+          <w:rFonts w:ascii="Times New Roman" w:hAnsi="Times New Roman" w:cs="Times New Roman"/>
+        </w:rPr>
+        <w:t>d---</w:t>
+      </w:r>
+      <w:proofErr w:type="gramEnd"/>
+      <w:r>
+        <w:rPr>
+          <w:rFonts w:ascii="Times New Roman" w:hAnsi="Times New Roman" w:cs="Times New Roman"/>
+        </w:rPr>
+        <w:t>--         03-May-</w:t>
+      </w:r>
+      <w:proofErr w:type="gramStart"/>
+      <w:r>
+        <w:rPr>
+          <w:rFonts w:ascii="Times New Roman" w:hAnsi="Times New Roman" w:cs="Times New Roman"/>
+        </w:rPr>
+        <w:t>26  09:37</w:t>
+      </w:r>
+      <w:proofErr w:type="gramEnd"/>
+      <w:r>
+        <w:rPr>
+          <w:rFonts w:ascii="Times New Roman" w:hAnsi="Times New Roman" w:cs="Times New Roman"/>
+        </w:rPr>
+        <w:t xml:space="preserve"> PM                build-info                                                                                                   </w:t>
+      </w:r>
+    </w:p>
+    <w:p>
+      <w:pPr>
+        <w:spacing w:after="0" w:line="276" w:lineRule="auto"/>
+        <w:rPr>
+          <w:rFonts w:ascii="Times New Roman" w:hAnsi="Times New Roman" w:cs="Times New Roman"/>
+        </w:rPr>
+      </w:pPr>
+      <w:r>
+        <w:rPr>
+          <w:rFonts w:ascii="Times New Roman" w:hAnsi="Times New Roman" w:cs="Times New Roman"/>
+        </w:rPr>
+        <w:lastRenderedPageBreak/>
+        <w:t>d-----         03-May-</w:t>
+      </w:r>
+      <w:proofErr w:type="gramStart"/>
+      <w:r>
+        <w:rPr>
+          <w:rFonts w:ascii="Times New Roman" w:hAnsi="Times New Roman" w:cs="Times New Roman"/>
+        </w:rPr>
+        <w:t>26  09:37</w:t>
+      </w:r>
+      <w:proofErr w:type="gramEnd"/>
+      <w:r>
+        <w:rPr>
+          <w:rFonts w:ascii="Times New Roman" w:hAnsi="Times New Roman" w:cs="Times New Roman"/>
+        </w:rPr>
+        <w:t xml:space="preserve"> PM                contracts                                                                                                    </w:t>
+      </w:r>
+    </w:p>
+    <w:p>
+      <w:pPr>
+        <w:spacing w:after="0" w:line="276" w:lineRule="auto"/>
+        <w:rPr>
+          <w:rFonts w:ascii="Times New Roman" w:hAnsi="Times New Roman" w:cs="Times New Roman"/>
+        </w:rPr>
+      </w:pPr>
+    </w:p>
+    <w:p>
+      <w:pPr>
+        <w:spacing w:after="0" w:line="276" w:lineRule="auto"/>
+        <w:rPr>
+          <w:rFonts w:ascii="Times New Roman" w:hAnsi="Times New Roman" w:cs="Times New Roman"/>
+        </w:rPr>
+      </w:pPr>
+    </w:p>
+    <w:p>
+      <w:pPr>
+        <w:spacing w:after="0" w:line="276" w:lineRule="auto"/>
+        <w:rPr>
+          <w:rFonts w:ascii="Times New Roman" w:hAnsi="Times New Roman" w:cs="Times New Roman"/>
+        </w:rPr>
+      </w:pPr>
+      <w:r>
+        <w:rPr>
+          <w:rFonts w:ascii="Times New Roman" w:hAnsi="Times New Roman" w:cs="Times New Roman"/>
+        </w:rPr>
+        <w:t xml:space="preserve">    Directory: D:\Users\DELL\new-onedrive\OneDrive - Institute of Business </w:t>
+      </w:r>
+    </w:p>
+    <w:p>
+      <w:pPr>
+        <w:spacing w:after="0" w:line="276" w:lineRule="auto"/>
+        <w:rPr>
+          <w:rFonts w:ascii="Times New Roman" w:hAnsi="Times New Roman" w:cs="Times New Roman"/>
+        </w:rPr>
+      </w:pPr>
+      <w:r>
+        <w:rPr>
+          <w:rFonts w:ascii="Times New Roman" w:hAnsi="Times New Roman" w:cs="Times New Roman"/>
+        </w:rPr>
+        <w:t xml:space="preserve">    Administration\iba\sem8\blockchain\CSE355_Introduction-to-Blockchain\programming_assignments\PA2\artifacts\build-info</w:t>
+      </w:r>
+    </w:p>
+    <w:p>
+      <w:pPr>
+        <w:spacing w:after="0" w:line="276" w:lineRule="auto"/>
+        <w:rPr>
+          <w:rFonts w:ascii="Times New Roman" w:hAnsi="Times New Roman" w:cs="Times New Roman"/>
+        </w:rPr>
+      </w:pPr>
+    </w:p>
+    <w:p>
+      <w:pPr>
+        <w:spacing w:after="0" w:line="276" w:lineRule="auto"/>
+        <w:rPr>
+          <w:rFonts w:ascii="Times New Roman" w:hAnsi="Times New Roman" w:cs="Times New Roman"/>
+        </w:rPr>
+      </w:pPr>
+    </w:p>
+    <w:p>
+      <w:pPr>
+        <w:spacing w:after="0" w:line="276" w:lineRule="auto"/>
+        <w:rPr>
+          <w:rFonts w:ascii="Times New Roman" w:hAnsi="Times New Roman" w:cs="Times New Roman"/>
+        </w:rPr>
+      </w:pPr>
+      <w:r>
+        <w:rPr>
+          <w:rFonts w:ascii="Times New Roman" w:hAnsi="Times New Roman" w:cs="Times New Roman"/>
+        </w:rPr>
+        <w:t xml:space="preserve">Mode                 </w:t>
+      </w:r>
+      <w:proofErr w:type="spellStart"/>
+      <w:r>
+        <w:rPr>
+          <w:rFonts w:ascii="Times New Roman" w:hAnsi="Times New Roman" w:cs="Times New Roman"/>
+        </w:rPr>
+        <w:t>LastWriteTime</w:t>
+      </w:r>
+      <w:proofErr w:type="spellEnd"/>
+      <w:r>
+        <w:rPr>
+          <w:rFonts w:ascii="Times New Roman" w:hAnsi="Times New Roman" w:cs="Times New Roman"/>
+        </w:rPr>
+        <w:t xml:space="preserve">         Length Name                                                                                                         </w:t>
+      </w:r>
+    </w:p>
+    <w:p>
+      <w:pPr>
+        <w:spacing w:after="0" w:line="276" w:lineRule="auto"/>
+        <w:rPr>
+          <w:rFonts w:ascii="Times New Roman" w:hAnsi="Times New Roman" w:cs="Times New Roman"/>
+        </w:rPr>
+      </w:pPr>
+      <w:r>
+        <w:rPr>
+          <w:rFonts w:ascii="Times New Roman" w:hAnsi="Times New Roman" w:cs="Times New Roman"/>
+        </w:rPr>
+        <w:t xml:space="preserve">----                 ------------- </w:t>
+      </w:r>
+      <w:proofErr w:type="gramStart"/>
+      <w:r>
+        <w:rPr>
+          <w:rFonts w:ascii="Times New Roman" w:hAnsi="Times New Roman" w:cs="Times New Roman"/>
+        </w:rPr>
+        <w:t xml:space="preserve">        </w:t>
+      </w:r>
+      <w:proofErr w:type="gramEnd"/>
+      <w:r>
+        <w:rPr>
+          <w:rFonts w:ascii="Times New Roman" w:hAnsi="Times New Roman" w:cs="Times New Roman"/>
+        </w:rPr>
+        <w:t xml:space="preserve">------ ----                                                                                                         </w:t>
+      </w:r>
+    </w:p>
+    <w:p>
+      <w:pPr>
+        <w:spacing w:after="0" w:line="276" w:lineRule="auto"/>
+        <w:rPr>
+          <w:rFonts w:ascii="Times New Roman" w:hAnsi="Times New Roman" w:cs="Times New Roman"/>
+        </w:rPr>
+      </w:pPr>
+      <w:r>
+        <w:rPr>
+          <w:rFonts w:ascii="Times New Roman" w:hAnsi="Times New Roman" w:cs="Times New Roman"/>
+        </w:rPr>
+        <w:t>-a----         03-May-</w:t>
+      </w:r>
+      <w:proofErr w:type="gramStart"/>
+      <w:r>
+        <w:rPr>
+          <w:rFonts w:ascii="Times New Roman" w:hAnsi="Times New Roman" w:cs="Times New Roman"/>
+        </w:rPr>
+        <w:t>26  09:37</w:t>
+      </w:r>
+      <w:proofErr w:type="gramEnd"/>
+      <w:r>
+        <w:rPr>
+          <w:rFonts w:ascii="Times New Roman" w:hAnsi="Times New Roman" w:cs="Times New Roman"/>
+        </w:rPr>
+        <w:t xml:space="preserve"> PM         882602 0ea17c13285d266a3e82d28ed187260f.json                                                                        </w:t>
+      </w:r>
+    </w:p>
+    <w:p>
+      <w:pPr>
+        <w:spacing w:after="0" w:line="276" w:lineRule="auto"/>
+        <w:rPr>
+          <w:rFonts w:ascii="Times New Roman" w:hAnsi="Times New Roman" w:cs="Times New Roman"/>
+        </w:rPr>
+      </w:pPr>
+    </w:p>
+    <w:p>
+      <w:pPr>
+        <w:spacing w:after="0" w:line="276" w:lineRule="auto"/>
+        <w:rPr>
+          <w:rFonts w:ascii="Times New Roman" w:hAnsi="Times New Roman" w:cs="Times New Roman"/>
+        </w:rPr>
+      </w:pPr>
+    </w:p>
+    <w:p>
+      <w:pPr>
+        <w:spacing w:after="0" w:line="276" w:lineRule="auto"/>
+        <w:rPr>
+          <w:rFonts w:ascii="Times New Roman" w:hAnsi="Times New Roman" w:cs="Times New Roman"/>
+        </w:rPr>
+      </w:pPr>
+      <w:r>
+        <w:rPr>
+          <w:rFonts w:ascii="Times New Roman" w:hAnsi="Times New Roman" w:cs="Times New Roman"/>
+        </w:rPr>
+        <w:t xml:space="preserve">    Directory: D:\Users\DELL\new-onedrive\OneDrive - Institute of Business </w:t>
+      </w:r>
+    </w:p>
+    <w:p>
+      <w:pPr>
+        <w:spacing w:after="0" w:line="276" w:lineRule="auto"/>
+        <w:rPr>
+          <w:rFonts w:ascii="Times New Roman" w:hAnsi="Times New Roman" w:cs="Times New Roman"/>
+        </w:rPr>
+      </w:pPr>
+      <w:r>
+        <w:rPr>
+          <w:rFonts w:ascii="Times New Roman" w:hAnsi="Times New Roman" w:cs="Times New Roman"/>
+        </w:rPr>
+        <w:t xml:space="preserve">    Administration\iba\sem8\blockchain\CSE355_Introduction-to-Blockchain\programming_assignments\PA2\artifacts\contracts</w:t>
+      </w:r>
+    </w:p>
+    <w:p>
+      <w:pPr>
+        <w:spacing w:after="0" w:line="276" w:lineRule="auto"/>
+        <w:rPr>
+          <w:rFonts w:ascii="Times New Roman" w:hAnsi="Times New Roman" w:cs="Times New Roman"/>
+        </w:rPr>
+      </w:pPr>
+    </w:p>
+    <w:p>
+      <w:pPr>
+        <w:spacing w:after="0" w:line="276" w:lineRule="auto"/>
+        <w:rPr>
+          <w:rFonts w:ascii="Times New Roman" w:hAnsi="Times New Roman" w:cs="Times New Roman"/>
+        </w:rPr>
+      </w:pPr>
+    </w:p>
+    <w:p>
+      <w:pPr>
+        <w:spacing w:after="0" w:line="276" w:lineRule="auto"/>
+        <w:rPr>
+          <w:rFonts w:ascii="Times New Roman" w:hAnsi="Times New Roman" w:cs="Times New Roman"/>
+        </w:rPr>
+      </w:pPr>
+      <w:r>
+        <w:rPr>
+          <w:rFonts w:ascii="Times New Roman" w:hAnsi="Times New Roman" w:cs="Times New Roman"/>
+        </w:rPr>
+        <w:t xml:space="preserve">Mode                 </w:t>
+      </w:r>
+      <w:proofErr w:type="spellStart"/>
+      <w:r>
+        <w:rPr>
+          <w:rFonts w:ascii="Times New Roman" w:hAnsi="Times New Roman" w:cs="Times New Roman"/>
+        </w:rPr>
+        <w:t>LastWriteTime</w:t>
+      </w:r>
+      <w:proofErr w:type="spellEnd"/>
+      <w:r>
+        <w:rPr>
+          <w:rFonts w:ascii="Times New Roman" w:hAnsi="Times New Roman" w:cs="Times New Roman"/>
+        </w:rPr>
+        <w:t xml:space="preserve">         Length Name                                                                                                         </w:t>
+      </w:r>
+    </w:p>
+    <w:p>
+      <w:pPr>
+        <w:spacing w:after="0" w:line="276" w:lineRule="auto"/>
+        <w:rPr>
+          <w:rFonts w:ascii="Times New Roman" w:hAnsi="Times New Roman" w:cs="Times New Roman"/>
+        </w:rPr>
+      </w:pPr>
+      <w:r>
+        <w:rPr>
+          <w:rFonts w:ascii="Times New Roman" w:hAnsi="Times New Roman" w:cs="Times New Roman"/>
+        </w:rPr>
+        <w:t xml:space="preserve">----                 ------------- </w:t>
+      </w:r>
+      <w:proofErr w:type="gramStart"/>
+      <w:r>
+        <w:rPr>
+          <w:rFonts w:ascii="Times New Roman" w:hAnsi="Times New Roman" w:cs="Times New Roman"/>
+        </w:rPr>
+        <w:t xml:space="preserve">        </w:t>
+      </w:r>
+      <w:proofErr w:type="gramEnd"/>
+      <w:r>
+        <w:rPr>
+          <w:rFonts w:ascii="Times New Roman" w:hAnsi="Times New Roman" w:cs="Times New Roman"/>
+        </w:rPr>
+        <w:t xml:space="preserve">------ ----                                                                                                         </w:t>
+      </w:r>
+    </w:p>
+    <w:p>
+      <w:pPr>
+        <w:spacing w:after="0" w:line="276" w:lineRule="auto"/>
+        <w:rPr>
+          <w:rFonts w:ascii="Times New Roman" w:hAnsi="Times New Roman" w:cs="Times New Roman"/>
+        </w:rPr>
+      </w:pPr>
+      <w:r>
+        <w:rPr>
+          <w:rFonts w:ascii="Times New Roman" w:hAnsi="Times New Roman" w:cs="Times New Roman"/>
+        </w:rPr>
+        <w:t>d-----         03-May-</w:t>
+      </w:r>
+      <w:proofErr w:type="gramStart"/>
+      <w:r>
+        <w:rPr>
+          <w:rFonts w:ascii="Times New Roman" w:hAnsi="Times New Roman" w:cs="Times New Roman"/>
+        </w:rPr>
+        <w:t>26  09:37</w:t>
+      </w:r>
+      <w:proofErr w:type="gramEnd"/>
+      <w:r>
+        <w:rPr>
+          <w:rFonts w:ascii="Times New Roman" w:hAnsi="Times New Roman" w:cs="Times New Roman"/>
+        </w:rPr>
+        <w:t xml:space="preserve"> PM                banking_26106_contract.sol                                                                                   </w:t>
+      </w:r>
+    </w:p>
+    <w:p>
+      <w:pPr>
+        <w:spacing w:after="0" w:line="276" w:lineRule="auto"/>
+        <w:rPr>
+          <w:rFonts w:ascii="Times New Roman" w:hAnsi="Times New Roman" w:cs="Times New Roman"/>
+        </w:rPr>
+      </w:pPr>
+      <w:r>
+        <w:rPr>
+          <w:rFonts w:ascii="Times New Roman" w:hAnsi="Times New Roman" w:cs="Times New Roman"/>
+        </w:rPr>
+        <w:t>d-----         03-May-</w:t>
+      </w:r>
+      <w:proofErr w:type="gramStart"/>
+      <w:r>
+        <w:rPr>
+          <w:rFonts w:ascii="Times New Roman" w:hAnsi="Times New Roman" w:cs="Times New Roman"/>
+        </w:rPr>
+        <w:t>26  09:37</w:t>
+      </w:r>
+      <w:proofErr w:type="gramEnd"/>
+      <w:r>
+        <w:rPr>
+          <w:rFonts w:ascii="Times New Roman" w:hAnsi="Times New Roman" w:cs="Times New Roman"/>
+        </w:rPr>
+        <w:t xml:space="preserve"> PM                </w:t>
+      </w:r>
+      <w:proofErr w:type="spellStart"/>
+      <w:r>
+        <w:rPr>
+          <w:rFonts w:ascii="Times New Roman" w:hAnsi="Times New Roman" w:cs="Times New Roman"/>
+        </w:rPr>
+        <w:t>Lock.sol</w:t>
+      </w:r>
+      <w:proofErr w:type="spellEnd"/>
+      <w:r>
+        <w:rPr>
+          <w:rFonts w:ascii="Times New Roman" w:hAnsi="Times New Roman" w:cs="Times New Roman"/>
+        </w:rPr>
+        <w:t xml:space="preserve">                                                                                                     </w:t>
+      </w:r>
+    </w:p>
+    <w:p>
+      <w:pPr>
+        <w:spacing w:after="0" w:line="276" w:lineRule="auto"/>
+        <w:rPr>
+          <w:rFonts w:ascii="Times New Roman" w:hAnsi="Times New Roman" w:cs="Times New Roman"/>
+        </w:rPr>
+      </w:pPr>
+    </w:p>
+    <w:p>
+      <w:pPr>
+        <w:spacing w:after="0" w:line="276" w:lineRule="auto"/>
+        <w:rPr>
+          <w:rFonts w:ascii="Times New Roman" w:hAnsi="Times New Roman" w:cs="Times New Roman"/>
+        </w:rPr>
+      </w:pPr>
+    </w:p>
+    <w:p>
+      <w:pPr>
+        <w:spacing w:after="0" w:line="276" w:lineRule="auto"/>
+        <w:rPr>
+          <w:rFonts w:ascii="Times New Roman" w:hAnsi="Times New Roman" w:cs="Times New Roman"/>
+        </w:rPr>
+      </w:pPr>
+      <w:r>
+        <w:rPr>
+          <w:rFonts w:ascii="Times New Roman" w:hAnsi="Times New Roman" w:cs="Times New Roman"/>
+        </w:rPr>
+        <w:t xml:space="preserve">    Directory: D:\Users\DELL\new-onedrive\OneDrive - Institute of Business </w:t>
+      </w:r>
+    </w:p>
+    <w:p>
+      <w:pPr>
+        <w:spacing w:after="0" w:line="276" w:lineRule="auto"/>
+        <w:rPr>
+          <w:rFonts w:ascii="Times New Roman" w:hAnsi="Times New Roman" w:cs="Times New Roman"/>
+        </w:rPr>
+      </w:pPr>
+      <w:r>
+        <w:rPr>
+          <w:rFonts w:ascii="Times New Roman" w:hAnsi="Times New Roman" w:cs="Times New Roman"/>
+        </w:rPr>
+        <w:t xml:space="preserve">    Administration\iba\sem8\blockchain\CSE355_Introduction-to-Blockchain\programming_assignments\PA2\artifacts\contracts\banking_26106_contract.sol</w:t>
+      </w:r>
+    </w:p>
+    <w:p>
+      <w:pPr>
+        <w:spacing w:after="0" w:line="276" w:lineRule="auto"/>
+        <w:rPr>
+          <w:rFonts w:ascii="Times New Roman" w:hAnsi="Times New Roman" w:cs="Times New Roman"/>
+        </w:rPr>
+      </w:pPr>
+    </w:p>
+    <w:p>
+      <w:pPr>
+        <w:spacing w:after="0" w:line="276" w:lineRule="auto"/>
+        <w:rPr>
+          <w:rFonts w:ascii="Times New Roman" w:hAnsi="Times New Roman" w:cs="Times New Roman"/>
+        </w:rPr>
+      </w:pPr>
+    </w:p>
+    <w:p>
+      <w:pPr>
+        <w:spacing w:after="0" w:line="276" w:lineRule="auto"/>
+        <w:rPr>
+          <w:rFonts w:ascii="Times New Roman" w:hAnsi="Times New Roman" w:cs="Times New Roman"/>
+        </w:rPr>
+      </w:pPr>
+      <w:r>
+        <w:rPr>
+          <w:rFonts w:ascii="Times New Roman" w:hAnsi="Times New Roman" w:cs="Times New Roman"/>
+        </w:rPr>
+        <w:t xml:space="preserve">Mode                 </w:t>
+      </w:r>
+      <w:proofErr w:type="spellStart"/>
+      <w:r>
+        <w:rPr>
+          <w:rFonts w:ascii="Times New Roman" w:hAnsi="Times New Roman" w:cs="Times New Roman"/>
+        </w:rPr>
+        <w:t>LastWriteTime</w:t>
+      </w:r>
+      <w:proofErr w:type="spellEnd"/>
+      <w:r>
+        <w:rPr>
+          <w:rFonts w:ascii="Times New Roman" w:hAnsi="Times New Roman" w:cs="Times New Roman"/>
+        </w:rPr>
+        <w:t xml:space="preserve">         Length Name                                                                                                         </w:t>
+      </w:r>
+    </w:p>
+    <w:p>
+      <w:pPr>
+        <w:spacing w:after="0" w:line="276" w:lineRule="auto"/>
+        <w:rPr>
+          <w:rFonts w:ascii="Times New Roman" w:hAnsi="Times New Roman" w:cs="Times New Roman"/>
+        </w:rPr>
+      </w:pPr>
+      <w:r>
+        <w:rPr>
+          <w:rFonts w:ascii="Times New Roman" w:hAnsi="Times New Roman" w:cs="Times New Roman"/>
+        </w:rPr>
+        <w:t xml:space="preserve">----                 ------------- </w:t>
+      </w:r>
+      <w:proofErr w:type="gramStart"/>
+      <w:r>
+        <w:rPr>
+          <w:rFonts w:ascii="Times New Roman" w:hAnsi="Times New Roman" w:cs="Times New Roman"/>
+        </w:rPr>
+        <w:t xml:space="preserve">        </w:t>
+      </w:r>
+      <w:proofErr w:type="gramEnd"/>
+      <w:r>
+        <w:rPr>
+          <w:rFonts w:ascii="Times New Roman" w:hAnsi="Times New Roman" w:cs="Times New Roman"/>
+        </w:rPr>
+        <w:t xml:space="preserve">------ ----                                                                                                         </w:t>
+      </w:r>
+    </w:p>
+    <w:p>
+      <w:pPr>
+        <w:spacing w:after="0" w:line="276" w:lineRule="auto"/>
+        <w:rPr>
+          <w:rFonts w:ascii="Times New Roman" w:hAnsi="Times New Roman" w:cs="Times New Roman"/>
+        </w:rPr>
+      </w:pPr>
+      <w:r>
+        <w:rPr>
+          <w:rFonts w:ascii="Times New Roman" w:hAnsi="Times New Roman" w:cs="Times New Roman"/>
+        </w:rPr>
+        <w:t>-a----         03-May-</w:t>
+      </w:r>
+      <w:proofErr w:type="gramStart"/>
+      <w:r>
+        <w:rPr>
+          <w:rFonts w:ascii="Times New Roman" w:hAnsi="Times New Roman" w:cs="Times New Roman"/>
+        </w:rPr>
+        <w:t>26  09:37</w:t>
+      </w:r>
+      <w:proofErr w:type="gramEnd"/>
+      <w:r>
+        <w:rPr>
+          <w:rFonts w:ascii="Times New Roman" w:hAnsi="Times New Roman" w:cs="Times New Roman"/>
+        </w:rPr>
+        <w:t xml:space="preserve"> PM            108 </w:t>
+      </w:r>
+      <w:proofErr w:type="spellStart"/>
+      <w:r>
+        <w:rPr>
+          <w:rFonts w:ascii="Times New Roman" w:hAnsi="Times New Roman" w:cs="Times New Roman"/>
+        </w:rPr>
+        <w:t>BankingSystem.dbg.json</w:t>
+      </w:r>
+      <w:proofErr w:type="spellEnd"/>
+      <w:r>
+        <w:rPr>
+          <w:rFonts w:ascii="Times New Roman" w:hAnsi="Times New Roman" w:cs="Times New Roman"/>
+        </w:rPr>
+        <w:t xml:space="preserve">                                                                                       </w:t>
+      </w:r>
+    </w:p>
+    <w:p>
+      <w:pPr>
+        <w:spacing w:after="0" w:line="276" w:lineRule="auto"/>
+        <w:rPr>
+          <w:rFonts w:ascii="Times New Roman" w:hAnsi="Times New Roman" w:cs="Times New Roman"/>
+        </w:rPr>
+      </w:pPr>
+      <w:r>
+        <w:rPr>
+          <w:rFonts w:ascii="Times New Roman" w:hAnsi="Times New Roman" w:cs="Times New Roman"/>
+        </w:rPr>
+        <w:t>-a----         03-May-</w:t>
+      </w:r>
+      <w:proofErr w:type="gramStart"/>
+      <w:r>
+        <w:rPr>
+          <w:rFonts w:ascii="Times New Roman" w:hAnsi="Times New Roman" w:cs="Times New Roman"/>
+        </w:rPr>
+        <w:t>26  09:37</w:t>
+      </w:r>
+      <w:proofErr w:type="gramEnd"/>
+      <w:r>
+        <w:rPr>
+          <w:rFonts w:ascii="Times New Roman" w:hAnsi="Times New Roman" w:cs="Times New Roman"/>
+        </w:rPr>
+        <w:t xml:space="preserve"> PM          64683 </w:t>
+      </w:r>
+      <w:proofErr w:type="spellStart"/>
+      <w:r>
+        <w:rPr>
+          <w:rFonts w:ascii="Times New Roman" w:hAnsi="Times New Roman" w:cs="Times New Roman"/>
+        </w:rPr>
+        <w:t>BankingSystem.json</w:t>
+      </w:r>
+      <w:proofErr w:type="spellEnd"/>
+      <w:r>
+        <w:rPr>
+          <w:rFonts w:ascii="Times New Roman" w:hAnsi="Times New Roman" w:cs="Times New Roman"/>
+        </w:rPr>
+        <w:t xml:space="preserve">                                                                                           </w:t>
+      </w:r>
+    </w:p>
+    <w:p>
+      <w:pPr>
+        <w:spacing w:after="0" w:line="276" w:lineRule="auto"/>
+        <w:rPr>
+          <w:rFonts w:ascii="Times New Roman" w:hAnsi="Times New Roman" w:cs="Times New Roman"/>
+        </w:rPr>
+      </w:pPr>
+    </w:p>
+    <w:p>
+      <w:pPr>
+        <w:spacing w:after="0" w:line="276" w:lineRule="auto"/>
+        <w:rPr>
+          <w:rFonts w:ascii="Times New Roman" w:hAnsi="Times New Roman" w:cs="Times New Roman"/>
+        </w:rPr>
+      </w:pPr>
+    </w:p>
+    <w:p>
+      <w:pPr>
+        <w:spacing w:after="0" w:line="276" w:lineRule="auto"/>
+        <w:rPr>
+          <w:rFonts w:ascii="Times New Roman" w:hAnsi="Times New Roman" w:cs="Times New Roman"/>
+        </w:rPr>
+      </w:pPr>
+      <w:r>
+        <w:rPr>
+          <w:rFonts w:ascii="Times New Roman" w:hAnsi="Times New Roman" w:cs="Times New Roman"/>
+        </w:rPr>
+        <w:t xml:space="preserve">    Directory: D:\Users\DELL\new-onedrive\OneDrive - Institute of Business </w:t>
+      </w:r>
+    </w:p>
+    <w:p>
+      <w:pPr>
+        <w:spacing w:after="0" w:line="276" w:lineRule="auto"/>
+        <w:rPr>
+          <w:rFonts w:ascii="Times New Roman" w:hAnsi="Times New Roman" w:cs="Times New Roman"/>
+        </w:rPr>
+      </w:pPr>
+      <w:r>
+        <w:rPr>
+          <w:rFonts w:ascii="Times New Roman" w:hAnsi="Times New Roman" w:cs="Times New Roman"/>
+        </w:rPr>
+        <w:t xml:space="preserve">    Administration\iba\sem8\blockchain\CSE355_Introduction-to-Blockchain\programming_assignments\PA2\artifacts\contracts\Lock.sol</w:t>
+      </w:r>
+    </w:p>
+    <w:p>
+      <w:pPr>
+        <w:spacing w:after="0" w:line="276" w:lineRule="auto"/>
+        <w:rPr>
+          <w:rFonts w:ascii="Times New Roman" w:hAnsi="Times New Roman" w:cs="Times New Roman"/>
+        </w:rPr>
+      </w:pPr>
+    </w:p>
+    <w:p>
+      <w:pPr>
+        <w:spacing w:after="0" w:line="276" w:lineRule="auto"/>
+        <w:rPr>
+          <w:rFonts w:ascii="Times New Roman" w:hAnsi="Times New Roman" w:cs="Times New Roman"/>
+        </w:rPr>
+      </w:pPr>
+    </w:p>
+    <w:p>
+      <w:pPr>
+        <w:spacing w:after="0" w:line="276" w:lineRule="auto"/>
+        <w:rPr>
+          <w:rFonts w:ascii="Times New Roman" w:hAnsi="Times New Roman" w:cs="Times New Roman"/>
+        </w:rPr>
+      </w:pPr>
+      <w:r>
+        <w:rPr>
+          <w:rFonts w:ascii="Times New Roman" w:hAnsi="Times New Roman" w:cs="Times New Roman"/>
+        </w:rPr>
+        <w:lastRenderedPageBreak/>
+        <w:t xml:space="preserve">Mode                 </w:t>
+      </w:r>
+      <w:proofErr w:type="spellStart"/>
+      <w:r>
+        <w:rPr>
+          <w:rFonts w:ascii="Times New Roman" w:hAnsi="Times New Roman" w:cs="Times New Roman"/>
+        </w:rPr>
+        <w:t>LastWriteTime</w:t>
+      </w:r>
+      <w:proofErr w:type="spellEnd"/>
+      <w:r>
+        <w:rPr>
+          <w:rFonts w:ascii="Times New Roman" w:hAnsi="Times New Roman" w:cs="Times New Roman"/>
+        </w:rPr>
+        <w:t xml:space="preserve">         Length Name                                                                                                         </w:t>
+      </w:r>
+    </w:p>
+    <w:p>
+      <w:pPr>
+        <w:spacing w:after="0" w:line="276" w:lineRule="auto"/>
+        <w:rPr>
+          <w:rFonts w:ascii="Times New Roman" w:hAnsi="Times New Roman" w:cs="Times New Roman"/>
+        </w:rPr>
+      </w:pPr>
+      <w:r>
+        <w:rPr>
+          <w:rFonts w:ascii="Times New Roman" w:hAnsi="Times New Roman" w:cs="Times New Roman"/>
+        </w:rPr>
+        <w:t xml:space="preserve">----                 ------------- </w:t>
+      </w:r>
+      <w:proofErr w:type="gramStart"/>
+      <w:r>
+        <w:rPr>
+          <w:rFonts w:ascii="Times New Roman" w:hAnsi="Times New Roman" w:cs="Times New Roman"/>
+        </w:rPr>
+        <w:t xml:space="preserve">        </w:t>
+      </w:r>
+      <w:proofErr w:type="gramEnd"/>
+      <w:r>
+        <w:rPr>
+          <w:rFonts w:ascii="Times New Roman" w:hAnsi="Times New Roman" w:cs="Times New Roman"/>
+        </w:rPr>
+        <w:t xml:space="preserve">------ ----                                                                                                         </w:t>
+      </w:r>
+    </w:p>
+    <w:p>
+      <w:pPr>
+        <w:spacing w:after="0" w:line="276" w:lineRule="auto"/>
+        <w:rPr>
+          <w:rFonts w:ascii="Times New Roman" w:hAnsi="Times New Roman" w:cs="Times New Roman"/>
+        </w:rPr>
+      </w:pPr>
+      <w:r>
+        <w:rPr>
+          <w:rFonts w:ascii="Times New Roman" w:hAnsi="Times New Roman" w:cs="Times New Roman"/>
+        </w:rPr>
+        <w:t>-a----         03-May-</w:t>
+      </w:r>
+      <w:proofErr w:type="gramStart"/>
+      <w:r>
+        <w:rPr>
+          <w:rFonts w:ascii="Times New Roman" w:hAnsi="Times New Roman" w:cs="Times New Roman"/>
+        </w:rPr>
+        <w:t>26  09:37</w:t>
+      </w:r>
+      <w:proofErr w:type="gramEnd"/>
+      <w:r>
+        <w:rPr>
+          <w:rFonts w:ascii="Times New Roman" w:hAnsi="Times New Roman" w:cs="Times New Roman"/>
+        </w:rPr>
+        <w:t xml:space="preserve"> PM            108 </w:t>
+      </w:r>
+      <w:proofErr w:type="spellStart"/>
+      <w:r>
+        <w:rPr>
+          <w:rFonts w:ascii="Times New Roman" w:hAnsi="Times New Roman" w:cs="Times New Roman"/>
+        </w:rPr>
+        <w:t>Lock.dbg.json</w:t>
+      </w:r>
+      <w:proofErr w:type="spellEnd"/>
+      <w:r>
+        <w:rPr>
+          <w:rFonts w:ascii="Times New Roman" w:hAnsi="Times New Roman" w:cs="Times New Roman"/>
+        </w:rPr>
+        <w:t xml:space="preserve">                                                                                                </w:t>
+      </w:r>
+    </w:p>
+    <w:p>
+      <w:pPr>
+        <w:spacing w:after="0" w:line="276" w:lineRule="auto"/>
+        <w:rPr>
+          <w:rFonts w:ascii="Times New Roman" w:hAnsi="Times New Roman" w:cs="Times New Roman"/>
+        </w:rPr>
+      </w:pPr>
+      <w:r>
+        <w:rPr>
+          <w:rFonts w:ascii="Times New Roman" w:hAnsi="Times New Roman" w:cs="Times New Roman"/>
+        </w:rPr>
+        <w:t>-a----         03-May-</w:t>
+      </w:r>
+      <w:proofErr w:type="gramStart"/>
+      <w:r>
+        <w:rPr>
+          <w:rFonts w:ascii="Times New Roman" w:hAnsi="Times New Roman" w:cs="Times New Roman"/>
+        </w:rPr>
+        <w:t>26  09:37</w:t>
+      </w:r>
+      <w:proofErr w:type="gramEnd"/>
+      <w:r>
+        <w:rPr>
+          <w:rFonts w:ascii="Times New Roman" w:hAnsi="Times New Roman" w:cs="Times New Roman"/>
+        </w:rPr>
+        <w:t xml:space="preserve"> PM           6552 </w:t>
+      </w:r>
+      <w:proofErr w:type="spellStart"/>
+      <w:r>
+        <w:rPr>
+          <w:rFonts w:ascii="Times New Roman" w:hAnsi="Times New Roman" w:cs="Times New Roman"/>
+        </w:rPr>
+        <w:t>Lock.json</w:t>
+      </w:r>
+      <w:proofErr w:type="spellEnd"/>
+      <w:r>
+        <w:rPr>
+          <w:rFonts w:ascii="Times New Roman" w:hAnsi="Times New Roman" w:cs="Times New Roman"/>
+        </w:rPr>
+        <w:t xml:space="preserve">                                                                                                    </w:t>
+      </w:r>
+    </w:p>
+    <w:p>
+      <w:pPr>
+        <w:spacing w:after="0" w:line="276" w:lineRule="auto"/>
+        <w:rPr>
+          <w:rFonts w:ascii="Times New Roman" w:hAnsi="Times New Roman" w:cs="Times New Roman"/>
+        </w:rPr>
+      </w:pPr>
+    </w:p>
+    <w:p>
+      <w:pPr>
+        <w:spacing w:after="0" w:line="276" w:lineRule="auto"/>
+        <w:rPr>
+          <w:rFonts w:ascii="Times New Roman" w:hAnsi="Times New Roman" w:cs="Times New Roman"/>
+        </w:rPr>
+      </w:pPr>
+    </w:p>
+    <w:p>
+      <w:pPr>
+        <w:spacing w:after="0" w:line="276" w:lineRule="auto"/>
+        <w:rPr>
+          <w:rFonts w:ascii="Times New Roman" w:hAnsi="Times New Roman" w:cs="Times New Roman"/>
+        </w:rPr>
+      </w:pPr>
+      <w:r>
+        <w:rPr>
+          <w:rFonts w:ascii="Times New Roman" w:hAnsi="Times New Roman" w:cs="Times New Roman"/>
+        </w:rPr>
+        <w:t xml:space="preserve">    Directory: D:\Users\DELL\new-onedrive\OneDrive - Institute of Business </w:t>
+      </w:r>
+    </w:p>
+    <w:p>
+      <w:pPr>
+        <w:spacing w:after="0" w:line="276" w:lineRule="auto"/>
+        <w:rPr>
+          <w:rFonts w:ascii="Times New Roman" w:hAnsi="Times New Roman" w:cs="Times New Roman"/>
+        </w:rPr>
+      </w:pPr>
+      <w:r>
+        <w:rPr>
+          <w:rFonts w:ascii="Times New Roman" w:hAnsi="Times New Roman" w:cs="Times New Roman"/>
+        </w:rPr>
+        <w:t xml:space="preserve">    Administration\iba\sem8\blockchain\CSE355_Introduction-to-Blockchain\programming_assignments\PA2\cache</w:t>
+      </w:r>
+    </w:p>
+    <w:p>
+      <w:pPr>
+        <w:spacing w:after="0" w:line="276" w:lineRule="auto"/>
+        <w:rPr>
+          <w:rFonts w:ascii="Times New Roman" w:hAnsi="Times New Roman" w:cs="Times New Roman"/>
+        </w:rPr>
+      </w:pPr>
+    </w:p>
+    <w:p>
+      <w:pPr>
+        <w:spacing w:after="0" w:line="276" w:lineRule="auto"/>
+        <w:rPr>
+          <w:rFonts w:ascii="Times New Roman" w:hAnsi="Times New Roman" w:cs="Times New Roman"/>
+        </w:rPr>
+      </w:pPr>
+    </w:p>
+    <w:p>
+      <w:pPr>
+        <w:spacing w:after="0" w:line="276" w:lineRule="auto"/>
+        <w:rPr>
+          <w:rFonts w:ascii="Times New Roman" w:hAnsi="Times New Roman" w:cs="Times New Roman"/>
+        </w:rPr>
+      </w:pPr>
+      <w:r>
+        <w:rPr>
+          <w:rFonts w:ascii="Times New Roman" w:hAnsi="Times New Roman" w:cs="Times New Roman"/>
+        </w:rPr>
+        <w:t xml:space="preserve">Mode                 </w:t>
+      </w:r>
+      <w:proofErr w:type="spellStart"/>
+      <w:r>
+        <w:rPr>
+          <w:rFonts w:ascii="Times New Roman" w:hAnsi="Times New Roman" w:cs="Times New Roman"/>
+        </w:rPr>
+        <w:t>LastWriteTime</w:t>
+      </w:r>
+      <w:proofErr w:type="spellEnd"/>
+      <w:r>
+        <w:rPr>
+          <w:rFonts w:ascii="Times New Roman" w:hAnsi="Times New Roman" w:cs="Times New Roman"/>
+        </w:rPr>
+        <w:t xml:space="preserve">         Length Name                                                                                                         </w:t>
+      </w:r>
+    </w:p>
+    <w:p>
+      <w:pPr>
+        <w:spacing w:after="0" w:line="276" w:lineRule="auto"/>
+        <w:rPr>
+          <w:rFonts w:ascii="Times New Roman" w:hAnsi="Times New Roman" w:cs="Times New Roman"/>
+        </w:rPr>
+      </w:pPr>
+      <w:r>
+        <w:rPr>
+          <w:rFonts w:ascii="Times New Roman" w:hAnsi="Times New Roman" w:cs="Times New Roman"/>
+        </w:rPr>
+        <w:t xml:space="preserve">----                 ------------- </w:t>
+      </w:r>
+      <w:proofErr w:type="gramStart"/>
+      <w:r>
+        <w:rPr>
+          <w:rFonts w:ascii="Times New Roman" w:hAnsi="Times New Roman" w:cs="Times New Roman"/>
+        </w:rPr>
+        <w:t xml:space="preserve">        </w:t>
+      </w:r>
+      <w:proofErr w:type="gramEnd"/>
+      <w:r>
+        <w:rPr>
+          <w:rFonts w:ascii="Times New Roman" w:hAnsi="Times New Roman" w:cs="Times New Roman"/>
+        </w:rPr>
+        <w:t xml:space="preserve">------ ----                                                                                                         </w:t>
+      </w:r>
+    </w:p>
+    <w:p>
+      <w:pPr>
+        <w:spacing w:after="0" w:line="276" w:lineRule="auto"/>
+        <w:rPr>
+          <w:rFonts w:ascii="Times New Roman" w:hAnsi="Times New Roman" w:cs="Times New Roman"/>
+        </w:rPr>
+      </w:pPr>
+      <w:r>
+        <w:rPr>
+          <w:rFonts w:ascii="Times New Roman" w:hAnsi="Times New Roman" w:cs="Times New Roman"/>
+        </w:rPr>
+        <w:t>-a----         03-May-</w:t>
+      </w:r>
+      <w:proofErr w:type="gramStart"/>
+      <w:r>
+        <w:rPr>
+          <w:rFonts w:ascii="Times New Roman" w:hAnsi="Times New Roman" w:cs="Times New Roman"/>
+        </w:rPr>
+        <w:t>26  09:39</w:t>
+      </w:r>
+      <w:proofErr w:type="gramEnd"/>
+      <w:r>
+        <w:rPr>
+          <w:rFonts w:ascii="Times New Roman" w:hAnsi="Times New Roman" w:cs="Times New Roman"/>
+        </w:rPr>
+        <w:t xml:space="preserve"> PM           2139 solidity-files-</w:t>
+      </w:r>
+      <w:proofErr w:type="spellStart"/>
+      <w:proofErr w:type="gramStart"/>
+      <w:r>
+        <w:rPr>
+          <w:rFonts w:ascii="Times New Roman" w:hAnsi="Times New Roman" w:cs="Times New Roman"/>
+        </w:rPr>
+        <w:t>cache.json</w:t>
+      </w:r>
+      <w:proofErr w:type="spellEnd"/>
+      <w:proofErr w:type="gramEnd"/>
+      <w:r>
+        <w:rPr>
+          <w:rFonts w:ascii="Times New Roman" w:hAnsi="Times New Roman" w:cs="Times New Roman"/>
+        </w:rPr>
+        <w:t xml:space="preserve">                                                                                    </w:t>
+      </w:r>
+    </w:p>
+    <w:p>
+      <w:pPr>
+        <w:spacing w:after="0" w:line="276" w:lineRule="auto"/>
+        <w:rPr>
+          <w:rFonts w:ascii="Times New Roman" w:hAnsi="Times New Roman" w:cs="Times New Roman"/>
+        </w:rPr>
+      </w:pPr>
+    </w:p>
+    <w:p>
+      <w:pPr>
+        <w:spacing w:after="0" w:line="276" w:lineRule="auto"/>
+        <w:rPr>
+          <w:rFonts w:ascii="Times New Roman" w:hAnsi="Times New Roman" w:cs="Times New Roman"/>
+        </w:rPr>
+      </w:pPr>
+    </w:p>
+    <w:p>
+      <w:pPr>
+        <w:spacing w:after="0" w:line="276" w:lineRule="auto"/>
+        <w:rPr>
+          <w:rFonts w:ascii="Times New Roman" w:hAnsi="Times New Roman" w:cs="Times New Roman"/>
+        </w:rPr>
+      </w:pPr>
+      <w:r>
+        <w:rPr>
+          <w:rFonts w:ascii="Times New Roman" w:hAnsi="Times New Roman" w:cs="Times New Roman"/>
+        </w:rPr>
+        <w:t xml:space="preserve">    Directory: D:\Users\DELL\new-onedrive\OneDrive - Institute of Business </w:t>
+      </w:r>
+    </w:p>
+    <w:p>
+      <w:pPr>
+        <w:spacing w:after="0" w:line="276" w:lineRule="auto"/>
+        <w:rPr>
+          <w:rFonts w:ascii="Times New Roman" w:hAnsi="Times New Roman" w:cs="Times New Roman"/>
+        </w:rPr>
+      </w:pPr>
+      <w:r>
+        <w:rPr>
+          <w:rFonts w:ascii="Times New Roman" w:hAnsi="Times New Roman" w:cs="Times New Roman"/>
+        </w:rPr>
+        <w:t xml:space="preserve">    Administration\iba\sem8\blockchain\CSE355_Introduction-to-Blockchain\programming_assignments\PA2\contracts</w:t>
+      </w:r>
+    </w:p>
+    <w:p>
+      <w:pPr>
+        <w:spacing w:after="0" w:line="276" w:lineRule="auto"/>
+        <w:rPr>
+          <w:rFonts w:ascii="Times New Roman" w:hAnsi="Times New Roman" w:cs="Times New Roman"/>
+        </w:rPr>
+      </w:pPr>
+    </w:p>
+    <w:p>
+      <w:pPr>
+        <w:spacing w:after="0" w:line="276" w:lineRule="auto"/>
+        <w:rPr>
+          <w:rFonts w:ascii="Times New Roman" w:hAnsi="Times New Roman" w:cs="Times New Roman"/>
+        </w:rPr>
+      </w:pPr>
+    </w:p>
+    <w:p>
+      <w:pPr>
+        <w:spacing w:after="0" w:line="276" w:lineRule="auto"/>
+        <w:rPr>
+          <w:rFonts w:ascii="Times New Roman" w:hAnsi="Times New Roman" w:cs="Times New Roman"/>
+        </w:rPr>
+      </w:pPr>
+      <w:r>
+        <w:rPr>
+          <w:rFonts w:ascii="Times New Roman" w:hAnsi="Times New Roman" w:cs="Times New Roman"/>
+        </w:rPr>
+        <w:t xml:space="preserve">Mode                 </w:t>
+      </w:r>
+      <w:proofErr w:type="spellStart"/>
+      <w:r>
+        <w:rPr>
+          <w:rFonts w:ascii="Times New Roman" w:hAnsi="Times New Roman" w:cs="Times New Roman"/>
+        </w:rPr>
+        <w:t>LastWriteTime</w:t>
+      </w:r>
+      <w:proofErr w:type="spellEnd"/>
+      <w:r>
+        <w:rPr>
+          <w:rFonts w:ascii="Times New Roman" w:hAnsi="Times New Roman" w:cs="Times New Roman"/>
+        </w:rPr>
+        <w:t xml:space="preserve">         Length Name                                                                                                         </w:t>
+      </w:r>
+    </w:p>
+    <w:p>
+      <w:pPr>
+        <w:spacing w:after="0" w:line="276" w:lineRule="auto"/>
+        <w:rPr>
+          <w:rFonts w:ascii="Times New Roman" w:hAnsi="Times New Roman" w:cs="Times New Roman"/>
+        </w:rPr>
+      </w:pPr>
+      <w:r>
+        <w:rPr>
+          <w:rFonts w:ascii="Times New Roman" w:hAnsi="Times New Roman" w:cs="Times New Roman"/>
+        </w:rPr>
+        <w:t xml:space="preserve">----                 ------------- </w:t>
+      </w:r>
+      <w:proofErr w:type="gramStart"/>
+      <w:r>
+        <w:rPr>
+          <w:rFonts w:ascii="Times New Roman" w:hAnsi="Times New Roman" w:cs="Times New Roman"/>
+        </w:rPr>
+        <w:t xml:space="preserve">        </w:t>
+      </w:r>
+      <w:proofErr w:type="gramEnd"/>
+      <w:r>
+        <w:rPr>
+          <w:rFonts w:ascii="Times New Roman" w:hAnsi="Times New Roman" w:cs="Times New Roman"/>
+        </w:rPr>
+        <w:t xml:space="preserve">------ ----                                                                                                         </w:t>
+      </w:r>
+    </w:p>
+    <w:p>
+      <w:pPr>
+        <w:spacing w:after="0" w:line="276" w:lineRule="auto"/>
+        <w:rPr>
+          <w:rFonts w:ascii="Times New Roman" w:hAnsi="Times New Roman" w:cs="Times New Roman"/>
+        </w:rPr>
+      </w:pPr>
+      <w:r>
+        <w:rPr>
+          <w:rFonts w:ascii="Times New Roman" w:hAnsi="Times New Roman" w:cs="Times New Roman"/>
+        </w:rPr>
+        <w:t>-a---l         03-May-</w:t>
+      </w:r>
+      <w:proofErr w:type="gramStart"/>
+      <w:r>
+        <w:rPr>
+          <w:rFonts w:ascii="Times New Roman" w:hAnsi="Times New Roman" w:cs="Times New Roman"/>
+        </w:rPr>
+        <w:t>26  09:29</w:t>
+      </w:r>
+      <w:proofErr w:type="gramEnd"/>
+      <w:r>
+        <w:rPr>
+          <w:rFonts w:ascii="Times New Roman" w:hAnsi="Times New Roman" w:cs="Times New Roman"/>
+        </w:rPr>
+        <w:t xml:space="preserve"> PM           9087 banking_26106_contract.sol                                                                                   </w:t>
+      </w:r>
+    </w:p>
+    <w:p>
+      <w:pPr>
+        <w:spacing w:after="0" w:line="276" w:lineRule="auto"/>
+        <w:rPr>
+          <w:rFonts w:ascii="Times New Roman" w:hAnsi="Times New Roman" w:cs="Times New Roman"/>
+        </w:rPr>
+      </w:pPr>
+      <w:r>
+        <w:rPr>
+          <w:rFonts w:ascii="Times New Roman" w:hAnsi="Times New Roman" w:cs="Times New Roman"/>
+        </w:rPr>
+        <w:t>-a----         03-May-</w:t>
+      </w:r>
+      <w:proofErr w:type="gramStart"/>
+      <w:r>
+        <w:rPr>
+          <w:rFonts w:ascii="Times New Roman" w:hAnsi="Times New Roman" w:cs="Times New Roman"/>
+        </w:rPr>
+        <w:t>26  09:27</w:t>
+      </w:r>
+      <w:proofErr w:type="gramEnd"/>
+      <w:r>
+        <w:rPr>
+          <w:rFonts w:ascii="Times New Roman" w:hAnsi="Times New Roman" w:cs="Times New Roman"/>
+        </w:rPr>
+        <w:t xml:space="preserve"> PM           1008 </w:t>
+      </w:r>
+      <w:proofErr w:type="spellStart"/>
+      <w:r>
+        <w:rPr>
+          <w:rFonts w:ascii="Times New Roman" w:hAnsi="Times New Roman" w:cs="Times New Roman"/>
+        </w:rPr>
+        <w:t>Lock.sol</w:t>
+      </w:r>
+      <w:proofErr w:type="spellEnd"/>
+      <w:r>
+        <w:rPr>
+          <w:rFonts w:ascii="Times New Roman" w:hAnsi="Times New Roman" w:cs="Times New Roman"/>
+        </w:rPr>
+        <w:t xml:space="preserve">                                                                                                     </w:t>
+      </w:r>
+    </w:p>
+    <w:p>
+      <w:pPr>
+        <w:spacing w:after="0" w:line="276" w:lineRule="auto"/>
+        <w:rPr>
+          <w:rFonts w:ascii="Times New Roman" w:hAnsi="Times New Roman" w:cs="Times New Roman"/>
+        </w:rPr>
+      </w:pPr>
+    </w:p>
+    <w:p>
+      <w:pPr>
+        <w:spacing w:after="0" w:line="276" w:lineRule="auto"/>
+        <w:rPr>
+          <w:rFonts w:ascii="Times New Roman" w:hAnsi="Times New Roman" w:cs="Times New Roman"/>
+        </w:rPr>
+      </w:pPr>
+    </w:p>
+    <w:p>
+      <w:pPr>
+        <w:spacing w:after="0" w:line="276" w:lineRule="auto"/>
+        <w:rPr>
+          <w:rFonts w:ascii="Times New Roman" w:hAnsi="Times New Roman" w:cs="Times New Roman"/>
+        </w:rPr>
+      </w:pPr>
+      <w:r>
+        <w:rPr>
+          <w:rFonts w:ascii="Times New Roman" w:hAnsi="Times New Roman" w:cs="Times New Roman"/>
+        </w:rPr>
+        <w:t xml:space="preserve">    Directory: D:\Users\DELL\new-onedrive\OneDrive - Institute of Business </w:t>
+      </w:r>
+    </w:p>
+    <w:p>
+      <w:pPr>
+        <w:spacing w:after="0" w:line="276" w:lineRule="auto"/>
+        <w:rPr>
+          <w:rFonts w:ascii="Times New Roman" w:hAnsi="Times New Roman" w:cs="Times New Roman"/>
+        </w:rPr>
+      </w:pPr>
+      <w:r>
+        <w:rPr>
+          <w:rFonts w:ascii="Times New Roman" w:hAnsi="Times New Roman" w:cs="Times New Roman"/>
+        </w:rPr>
+        <w:t xml:space="preserve">    Administration\iba\sem8\blockchain\CSE355_Introduction-to-Blockchain\programming_assignments\PA2\ignition</w:t>
+      </w:r>
+    </w:p>
+    <w:p>
+      <w:pPr>
+        <w:spacing w:after="0" w:line="276" w:lineRule="auto"/>
+        <w:rPr>
+          <w:rFonts w:ascii="Times New Roman" w:hAnsi="Times New Roman" w:cs="Times New Roman"/>
+        </w:rPr>
+      </w:pPr>
+    </w:p>
+    <w:p>
+      <w:pPr>
+        <w:spacing w:after="0" w:line="276" w:lineRule="auto"/>
+        <w:rPr>
+          <w:rFonts w:ascii="Times New Roman" w:hAnsi="Times New Roman" w:cs="Times New Roman"/>
+        </w:rPr>
+      </w:pPr>
+    </w:p>
+    <w:p>
+      <w:pPr>
+        <w:spacing w:after="0" w:line="276" w:lineRule="auto"/>
+        <w:rPr>
+          <w:rFonts w:ascii="Times New Roman" w:hAnsi="Times New Roman" w:cs="Times New Roman"/>
+        </w:rPr>
+      </w:pPr>
+      <w:r>
+        <w:rPr>
+          <w:rFonts w:ascii="Times New Roman" w:hAnsi="Times New Roman" w:cs="Times New Roman"/>
+        </w:rPr>
+        <w:t xml:space="preserve">Mode                 </w:t>
+      </w:r>
+      <w:proofErr w:type="spellStart"/>
+      <w:r>
+        <w:rPr>
+          <w:rFonts w:ascii="Times New Roman" w:hAnsi="Times New Roman" w:cs="Times New Roman"/>
+        </w:rPr>
+        <w:t>LastWriteTime</w:t>
+      </w:r>
+      <w:proofErr w:type="spellEnd"/>
+      <w:r>
+        <w:rPr>
+          <w:rFonts w:ascii="Times New Roman" w:hAnsi="Times New Roman" w:cs="Times New Roman"/>
+        </w:rPr>
+        <w:t xml:space="preserve">         Length Name                                                                                                         </w:t>
+      </w:r>
+    </w:p>
+    <w:p>
+      <w:pPr>
+        <w:spacing w:after="0" w:line="276" w:lineRule="auto"/>
+        <w:rPr>
+          <w:rFonts w:ascii="Times New Roman" w:hAnsi="Times New Roman" w:cs="Times New Roman"/>
+        </w:rPr>
+      </w:pPr>
+      <w:r>
+        <w:rPr>
+          <w:rFonts w:ascii="Times New Roman" w:hAnsi="Times New Roman" w:cs="Times New Roman"/>
+        </w:rPr>
+        <w:t xml:space="preserve">----                 ------------- </w:t>
+      </w:r>
+      <w:proofErr w:type="gramStart"/>
+      <w:r>
+        <w:rPr>
+          <w:rFonts w:ascii="Times New Roman" w:hAnsi="Times New Roman" w:cs="Times New Roman"/>
+        </w:rPr>
+        <w:t xml:space="preserve">        </w:t>
+      </w:r>
+      <w:proofErr w:type="gramEnd"/>
+      <w:r>
+        <w:rPr>
+          <w:rFonts w:ascii="Times New Roman" w:hAnsi="Times New Roman" w:cs="Times New Roman"/>
+        </w:rPr>
+        <w:t xml:space="preserve">------ ----                                                                                                         </w:t>
+      </w:r>
+    </w:p>
+    <w:p>
+      <w:pPr>
+        <w:spacing w:after="0" w:line="276" w:lineRule="auto"/>
+        <w:rPr>
+          <w:rFonts w:ascii="Times New Roman" w:hAnsi="Times New Roman" w:cs="Times New Roman"/>
+        </w:rPr>
+      </w:pPr>
+      <w:r>
+        <w:rPr>
+          <w:rFonts w:ascii="Times New Roman" w:hAnsi="Times New Roman" w:cs="Times New Roman"/>
+        </w:rPr>
+        <w:t>d-----         03-May-</w:t>
+      </w:r>
+      <w:proofErr w:type="gramStart"/>
+      <w:r>
+        <w:rPr>
+          <w:rFonts w:ascii="Times New Roman" w:hAnsi="Times New Roman" w:cs="Times New Roman"/>
+        </w:rPr>
+        <w:t>26  09:29</w:t>
+      </w:r>
+      <w:proofErr w:type="gramEnd"/>
+      <w:r>
+        <w:rPr>
+          <w:rFonts w:ascii="Times New Roman" w:hAnsi="Times New Roman" w:cs="Times New Roman"/>
+        </w:rPr>
+        <w:t xml:space="preserve"> PM                modules                                                                                                      </w:t>
+      </w:r>
+    </w:p>
+    <w:p>
+      <w:pPr>
+        <w:spacing w:after="0" w:line="276" w:lineRule="auto"/>
+        <w:rPr>
+          <w:rFonts w:ascii="Times New Roman" w:hAnsi="Times New Roman" w:cs="Times New Roman"/>
+        </w:rPr>
+      </w:pPr>
+    </w:p>
+    <w:p>
+      <w:pPr>
+        <w:spacing w:after="0" w:line="276" w:lineRule="auto"/>
+        <w:rPr>
+          <w:rFonts w:ascii="Times New Roman" w:hAnsi="Times New Roman" w:cs="Times New Roman"/>
+        </w:rPr>
+      </w:pPr>
+    </w:p>
+    <w:p>
+      <w:pPr>
+        <w:spacing w:after="0" w:line="276" w:lineRule="auto"/>
+        <w:rPr>
+          <w:rFonts w:ascii="Times New Roman" w:hAnsi="Times New Roman" w:cs="Times New Roman"/>
+        </w:rPr>
+      </w:pPr>
+      <w:r>
+        <w:rPr>
+          <w:rFonts w:ascii="Times New Roman" w:hAnsi="Times New Roman" w:cs="Times New Roman"/>
+        </w:rPr>
+        <w:t xml:space="preserve">    Directory: D:\Users\DELL\new-onedrive\OneDrive - Institute of Business </w:t>
+      </w:r>
+    </w:p>
+    <w:p>
+      <w:pPr>
+        <w:spacing w:after="0" w:line="276" w:lineRule="auto"/>
+        <w:rPr>
+          <w:rFonts w:ascii="Times New Roman" w:hAnsi="Times New Roman" w:cs="Times New Roman"/>
+        </w:rPr>
+      </w:pPr>
+      <w:r>
+        <w:rPr>
+          <w:rFonts w:ascii="Times New Roman" w:hAnsi="Times New Roman" w:cs="Times New Roman"/>
+        </w:rPr>
+        <w:t xml:space="preserve">    Administration\iba\sem8\blockchain\CSE355_Introduction-to-Blockchain\programming_assignments\PA2\ignition\modules</w:t>
+      </w:r>
+    </w:p>
+    <w:p>
+      <w:pPr>
+        <w:spacing w:after="0" w:line="276" w:lineRule="auto"/>
+        <w:rPr>
+          <w:rFonts w:ascii="Times New Roman" w:hAnsi="Times New Roman" w:cs="Times New Roman"/>
+        </w:rPr>
+      </w:pPr>
+    </w:p>
+    <w:p>
+      <w:pPr>
+        <w:spacing w:after="0" w:line="276" w:lineRule="auto"/>
+        <w:rPr>
+          <w:rFonts w:ascii="Times New Roman" w:hAnsi="Times New Roman" w:cs="Times New Roman"/>
+        </w:rPr>
+      </w:pPr>
+    </w:p>
+    <w:p>
+      <w:pPr>
+        <w:spacing w:after="0" w:line="276" w:lineRule="auto"/>
+        <w:rPr>
+          <w:rFonts w:ascii="Times New Roman" w:hAnsi="Times New Roman" w:cs="Times New Roman"/>
+        </w:rPr>
+      </w:pPr>
+      <w:r>
+        <w:rPr>
+          <w:rFonts w:ascii="Times New Roman" w:hAnsi="Times New Roman" w:cs="Times New Roman"/>
+        </w:rPr>
+        <w:t xml:space="preserve">Mode                 </w:t>
+      </w:r>
+      <w:proofErr w:type="spellStart"/>
+      <w:r>
+        <w:rPr>
+          <w:rFonts w:ascii="Times New Roman" w:hAnsi="Times New Roman" w:cs="Times New Roman"/>
+        </w:rPr>
+        <w:t>LastWriteTime</w:t>
+      </w:r>
+      <w:proofErr w:type="spellEnd"/>
+      <w:r>
+        <w:rPr>
+          <w:rFonts w:ascii="Times New Roman" w:hAnsi="Times New Roman" w:cs="Times New Roman"/>
+        </w:rPr>
+        <w:t xml:space="preserve">         Length Name                                                                                                         </w:t>
+      </w:r>
+    </w:p>
+    <w:p>
+      <w:pPr>
+        <w:spacing w:after="0" w:line="276" w:lineRule="auto"/>
+        <w:rPr>
+          <w:rFonts w:ascii="Times New Roman" w:hAnsi="Times New Roman" w:cs="Times New Roman"/>
+        </w:rPr>
+      </w:pPr>
+      <w:r>
+        <w:rPr>
+          <w:rFonts w:ascii="Times New Roman" w:hAnsi="Times New Roman" w:cs="Times New Roman"/>
+        </w:rPr>
+        <w:t xml:space="preserve">----                 ------------- </w:t>
+      </w:r>
+      <w:proofErr w:type="gramStart"/>
+      <w:r>
+        <w:rPr>
+          <w:rFonts w:ascii="Times New Roman" w:hAnsi="Times New Roman" w:cs="Times New Roman"/>
+        </w:rPr>
+        <w:t xml:space="preserve">        </w:t>
+      </w:r>
+      <w:proofErr w:type="gramEnd"/>
+      <w:r>
+        <w:rPr>
+          <w:rFonts w:ascii="Times New Roman" w:hAnsi="Times New Roman" w:cs="Times New Roman"/>
+        </w:rPr>
+        <w:t xml:space="preserve">------ ----                                                                                                         </w:t>
+      </w:r>
+    </w:p>
+    <w:p>
+      <w:pPr>
+        <w:spacing w:after="0" w:line="276" w:lineRule="auto"/>
+        <w:rPr>
+          <w:rFonts w:ascii="Times New Roman" w:hAnsi="Times New Roman" w:cs="Times New Roman"/>
+        </w:rPr>
+      </w:pPr>
+      <w:r>
+        <w:rPr>
+          <w:rFonts w:ascii="Times New Roman" w:hAnsi="Times New Roman" w:cs="Times New Roman"/>
+        </w:rPr>
+        <w:t>-a----         03-May-</w:t>
+      </w:r>
+      <w:proofErr w:type="gramStart"/>
+      <w:r>
+        <w:rPr>
+          <w:rFonts w:ascii="Times New Roman" w:hAnsi="Times New Roman" w:cs="Times New Roman"/>
+        </w:rPr>
+        <w:t>26  09:27</w:t>
+      </w:r>
+      <w:proofErr w:type="gramEnd"/>
+      <w:r>
+        <w:rPr>
+          <w:rFonts w:ascii="Times New Roman" w:hAnsi="Times New Roman" w:cs="Times New Roman"/>
+        </w:rPr>
+        <w:t xml:space="preserve"> PM            564 Lock.js                                                                                                      </w:t>
+      </w:r>
+    </w:p>
+    <w:p>
+      <w:pPr>
+        <w:spacing w:after="0" w:line="276" w:lineRule="auto"/>
+        <w:rPr>
+          <w:rFonts w:ascii="Times New Roman" w:hAnsi="Times New Roman" w:cs="Times New Roman"/>
+        </w:rPr>
+      </w:pPr>
+    </w:p>
+    <w:p>
+      <w:pPr>
+        <w:spacing w:after="0" w:line="276" w:lineRule="auto"/>
+        <w:rPr>
+          <w:rFonts w:ascii="Times New Roman" w:hAnsi="Times New Roman" w:cs="Times New Roman"/>
+        </w:rPr>
+      </w:pPr>
+    </w:p>
+    <w:p>
+      <w:pPr>
+        <w:spacing w:after="0" w:line="276" w:lineRule="auto"/>
+        <w:rPr>
+          <w:rFonts w:ascii="Times New Roman" w:hAnsi="Times New Roman" w:cs="Times New Roman"/>
+        </w:rPr>
+      </w:pPr>
+      <w:r>
+        <w:rPr>
+          <w:rFonts w:ascii="Times New Roman" w:hAnsi="Times New Roman" w:cs="Times New Roman"/>
+        </w:rPr>
+        <w:t xml:space="preserve">    Directory: D:\Users\DELL\new-onedrive\OneDrive - Institute of Business </w:t>
+      </w:r>
+    </w:p>
+    <w:p>
+      <w:pPr>
+        <w:spacing w:after="0" w:line="276" w:lineRule="auto"/>
+        <w:rPr>
+          <w:rFonts w:ascii="Times New Roman" w:hAnsi="Times New Roman" w:cs="Times New Roman"/>
+        </w:rPr>
+      </w:pPr>
+      <w:r>
+        <w:rPr>
+          <w:rFonts w:ascii="Times New Roman" w:hAnsi="Times New Roman" w:cs="Times New Roman"/>
+        </w:rPr>
+        <w:t xml:space="preserve">    Administration\iba\sem8\blockchain\CSE355_Introduction-to-Blockchain\programming_assignments\PA2\Solidity Test Files</w:t>
+      </w:r>
+    </w:p>
+    <w:p>
+      <w:pPr>
+        <w:spacing w:after="0" w:line="276" w:lineRule="auto"/>
+        <w:rPr>
+          <w:rFonts w:ascii="Times New Roman" w:hAnsi="Times New Roman" w:cs="Times New Roman"/>
+        </w:rPr>
+      </w:pPr>
+    </w:p>
+    <w:p>
+      <w:pPr>
+        <w:spacing w:after="0" w:line="276" w:lineRule="auto"/>
+        <w:rPr>
+          <w:rFonts w:ascii="Times New Roman" w:hAnsi="Times New Roman" w:cs="Times New Roman"/>
+        </w:rPr>
+      </w:pPr>
+    </w:p>
+    <w:p>
+      <w:pPr>
+        <w:spacing w:after="0" w:line="276" w:lineRule="auto"/>
+        <w:rPr>
+          <w:rFonts w:ascii="Times New Roman" w:hAnsi="Times New Roman" w:cs="Times New Roman"/>
+        </w:rPr>
+      </w:pPr>
+      <w:r>
+        <w:rPr>
+          <w:rFonts w:ascii="Times New Roman" w:hAnsi="Times New Roman" w:cs="Times New Roman"/>
+        </w:rPr>
+        <w:t xml:space="preserve">Mode                 </w:t>
+      </w:r>
+      <w:proofErr w:type="spellStart"/>
+      <w:r>
+        <w:rPr>
+          <w:rFonts w:ascii="Times New Roman" w:hAnsi="Times New Roman" w:cs="Times New Roman"/>
+        </w:rPr>
+        <w:t>LastWriteTime</w:t>
+      </w:r>
+      <w:proofErr w:type="spellEnd"/>
+      <w:r>
+        <w:rPr>
+          <w:rFonts w:ascii="Times New Roman" w:hAnsi="Times New Roman" w:cs="Times New Roman"/>
+        </w:rPr>
+        <w:t xml:space="preserve">         Length Name                                                                                                         </w:t>
+      </w:r>
+    </w:p>
+    <w:p>
+      <w:pPr>
+        <w:spacing w:after="0" w:line="276" w:lineRule="auto"/>
+        <w:rPr>
+          <w:rFonts w:ascii="Times New Roman" w:hAnsi="Times New Roman" w:cs="Times New Roman"/>
+        </w:rPr>
+      </w:pPr>
+      <w:r>
+        <w:rPr>
+          <w:rFonts w:ascii="Times New Roman" w:hAnsi="Times New Roman" w:cs="Times New Roman"/>
+        </w:rPr>
+        <w:t xml:space="preserve">----                 ------------- </w:t>
+      </w:r>
+      <w:proofErr w:type="gramStart"/>
+      <w:r>
+        <w:rPr>
+          <w:rFonts w:ascii="Times New Roman" w:hAnsi="Times New Roman" w:cs="Times New Roman"/>
+        </w:rPr>
+        <w:t xml:space="preserve">        </w:t>
+      </w:r>
+      <w:proofErr w:type="gramEnd"/>
+      <w:r>
+        <w:rPr>
+          <w:rFonts w:ascii="Times New Roman" w:hAnsi="Times New Roman" w:cs="Times New Roman"/>
+        </w:rPr>
+        <w:t xml:space="preserve">------ ----                                                                                                         </w:t>
+      </w:r>
+    </w:p>
+    <w:p>
+      <w:pPr>
+        <w:spacing w:after="0" w:line="276" w:lineRule="auto"/>
+        <w:rPr>
+          <w:rFonts w:ascii="Times New Roman" w:hAnsi="Times New Roman" w:cs="Times New Roman"/>
+        </w:rPr>
+      </w:pPr>
+      <w:r>
+        <w:rPr>
+          <w:rFonts w:ascii="Times New Roman" w:hAnsi="Times New Roman" w:cs="Times New Roman"/>
+        </w:rPr>
+        <w:t>-a---l         03-May-</w:t>
+      </w:r>
+      <w:proofErr w:type="gramStart"/>
+      <w:r>
+        <w:rPr>
+          <w:rFonts w:ascii="Times New Roman" w:hAnsi="Times New Roman" w:cs="Times New Roman"/>
+        </w:rPr>
+        <w:t>26  08:52</w:t>
+      </w:r>
+      <w:proofErr w:type="gramEnd"/>
+      <w:r>
+        <w:rPr>
+          <w:rFonts w:ascii="Times New Roman" w:hAnsi="Times New Roman" w:cs="Times New Roman"/>
+        </w:rPr>
+        <w:t xml:space="preserve"> PM           9655 </w:t>
+      </w:r>
+      <w:proofErr w:type="spellStart"/>
+      <w:r>
+        <w:rPr>
+          <w:rFonts w:ascii="Times New Roman" w:hAnsi="Times New Roman" w:cs="Times New Roman"/>
+        </w:rPr>
+        <w:t>banking_test.sol</w:t>
+      </w:r>
+      <w:proofErr w:type="spellEnd"/>
+      <w:r>
+        <w:rPr>
+          <w:rFonts w:ascii="Times New Roman" w:hAnsi="Times New Roman" w:cs="Times New Roman"/>
+        </w:rPr>
+        <w:t xml:space="preserve">                                                                                             </w:t>
+      </w:r>
+    </w:p>
+    <w:p>
+      <w:pPr>
+        <w:spacing w:after="0" w:line="276" w:lineRule="auto"/>
+        <w:rPr>
+          <w:rFonts w:ascii="Times New Roman" w:hAnsi="Times New Roman" w:cs="Times New Roman"/>
+        </w:rPr>
+      </w:pPr>
+      <w:r>
+        <w:rPr>
+          <w:rFonts w:ascii="Times New Roman" w:hAnsi="Times New Roman" w:cs="Times New Roman"/>
+        </w:rPr>
+        <w:t>-a---l         03-May-</w:t>
+      </w:r>
+      <w:proofErr w:type="gramStart"/>
+      <w:r>
+        <w:rPr>
+          <w:rFonts w:ascii="Times New Roman" w:hAnsi="Times New Roman" w:cs="Times New Roman"/>
+        </w:rPr>
+        <w:t>26  08:52</w:t>
+      </w:r>
+      <w:proofErr w:type="gramEnd"/>
+      <w:r>
+        <w:rPr>
+          <w:rFonts w:ascii="Times New Roman" w:hAnsi="Times New Roman" w:cs="Times New Roman"/>
+        </w:rPr>
+        <w:t xml:space="preserve"> PM          13436 </w:t>
+      </w:r>
+      <w:proofErr w:type="spellStart"/>
+      <w:r>
+        <w:rPr>
+          <w:rFonts w:ascii="Times New Roman" w:hAnsi="Times New Roman" w:cs="Times New Roman"/>
+        </w:rPr>
+        <w:t>exceptions_test.sol</w:t>
+      </w:r>
+      <w:proofErr w:type="spellEnd"/>
+      <w:r>
+        <w:rPr>
+          <w:rFonts w:ascii="Times New Roman" w:hAnsi="Times New Roman" w:cs="Times New Roman"/>
+        </w:rPr>
+        <w:t xml:space="preserve">                                                                                          </w:t>
+      </w:r>
+    </w:p>
+    <w:p>
+      <w:pPr>
+        <w:spacing w:after="0" w:line="276" w:lineRule="auto"/>
+        <w:rPr>
+          <w:rFonts w:ascii="Times New Roman" w:hAnsi="Times New Roman" w:cs="Times New Roman"/>
+        </w:rPr>
+      </w:pPr>
+      <w:r>
+        <w:rPr>
+          <w:rFonts w:ascii="Times New Roman" w:hAnsi="Times New Roman" w:cs="Times New Roman"/>
+        </w:rPr>
+        <w:t>-a---l         03-May-</w:t>
+      </w:r>
+      <w:proofErr w:type="gramStart"/>
+      <w:r>
+        <w:rPr>
+          <w:rFonts w:ascii="Times New Roman" w:hAnsi="Times New Roman" w:cs="Times New Roman"/>
+        </w:rPr>
+        <w:t>26  08:52</w:t>
+      </w:r>
+      <w:proofErr w:type="gramEnd"/>
+      <w:r>
+        <w:rPr>
+          <w:rFonts w:ascii="Times New Roman" w:hAnsi="Times New Roman" w:cs="Times New Roman"/>
+        </w:rPr>
+        <w:t xml:space="preserve"> PM          15592 </w:t>
+      </w:r>
+      <w:proofErr w:type="spellStart"/>
+      <w:r>
+        <w:rPr>
+          <w:rFonts w:ascii="Times New Roman" w:hAnsi="Times New Roman" w:cs="Times New Roman"/>
+        </w:rPr>
+        <w:t>interest_test.sol</w:t>
+      </w:r>
+      <w:proofErr w:type="spellEnd"/>
+      <w:r>
+        <w:rPr>
+          <w:rFonts w:ascii="Times New Roman" w:hAnsi="Times New Roman" w:cs="Times New Roman"/>
+        </w:rPr>
+        <w:t xml:space="preserve">                                                                                            </w:t>
+      </w:r>
+    </w:p>
+    <w:p>
+      <w:pPr>
+        <w:spacing w:after="0" w:line="276" w:lineRule="auto"/>
+        <w:rPr>
+          <w:rFonts w:ascii="Times New Roman" w:hAnsi="Times New Roman" w:cs="Times New Roman"/>
+        </w:rPr>
+      </w:pPr>
+      <w:r>
+        <w:rPr>
+          <w:rFonts w:ascii="Times New Roman" w:hAnsi="Times New Roman" w:cs="Times New Roman"/>
+        </w:rPr>
+        <w:t>-a---l         03-May-</w:t>
+      </w:r>
+      <w:proofErr w:type="gramStart"/>
+      <w:r>
+        <w:rPr>
+          <w:rFonts w:ascii="Times New Roman" w:hAnsi="Times New Roman" w:cs="Times New Roman"/>
+        </w:rPr>
+        <w:t>26  08:52</w:t>
+      </w:r>
+      <w:proofErr w:type="gramEnd"/>
+      <w:r>
+        <w:rPr>
+          <w:rFonts w:ascii="Times New Roman" w:hAnsi="Times New Roman" w:cs="Times New Roman"/>
+        </w:rPr>
+        <w:t xml:space="preserve"> PM           7965 </w:t>
+      </w:r>
+      <w:proofErr w:type="spellStart"/>
+      <w:r>
+        <w:rPr>
+          <w:rFonts w:ascii="Times New Roman" w:hAnsi="Times New Roman" w:cs="Times New Roman"/>
+        </w:rPr>
+        <w:t>owner_test.sol</w:t>
+      </w:r>
+      <w:proofErr w:type="spellEnd"/>
+      <w:r>
+        <w:rPr>
+          <w:rFonts w:ascii="Times New Roman" w:hAnsi="Times New Roman" w:cs="Times New Roman"/>
+        </w:rPr>
+        <w:t xml:space="preserve">                                                                                               </w:t>
+      </w:r>
+    </w:p>
+    <w:p>
+      <w:pPr>
+        <w:spacing w:after="0" w:line="276" w:lineRule="auto"/>
+        <w:rPr>
+          <w:rFonts w:ascii="Times New Roman" w:hAnsi="Times New Roman" w:cs="Times New Roman"/>
+        </w:rPr>
+      </w:pPr>
+    </w:p>
+    <w:p>
+      <w:pPr>
+        <w:spacing w:after="0" w:line="276" w:lineRule="auto"/>
+        <w:rPr>
+          <w:rFonts w:ascii="Times New Roman" w:hAnsi="Times New Roman" w:cs="Times New Roman"/>
+        </w:rPr>
+      </w:pPr>
+    </w:p>
+    <w:p>
+      <w:pPr>
+        <w:spacing w:after="0" w:line="276" w:lineRule="auto"/>
+        <w:rPr>
+          <w:rFonts w:ascii="Times New Roman" w:hAnsi="Times New Roman" w:cs="Times New Roman"/>
+        </w:rPr>
+      </w:pPr>
+      <w:r>
+        <w:rPr>
+          <w:rFonts w:ascii="Times New Roman" w:hAnsi="Times New Roman" w:cs="Times New Roman"/>
+        </w:rPr>
+        <w:t xml:space="preserve">    Directory: D:\Users\DELL\new-onedrive\OneDrive - Institute of Business </w:t>
+      </w:r>
+    </w:p>
+    <w:p>
+      <w:pPr>
+        <w:spacing w:after="0" w:line="276" w:lineRule="auto"/>
+        <w:rPr>
+          <w:rFonts w:ascii="Times New Roman" w:hAnsi="Times New Roman" w:cs="Times New Roman"/>
+        </w:rPr>
+      </w:pPr>
+      <w:r>
+        <w:rPr>
+          <w:rFonts w:ascii="Times New Roman" w:hAnsi="Times New Roman" w:cs="Times New Roman"/>
+        </w:rPr>
+        <w:t xml:space="preserve">    Administration\iba\sem8\blockchain\CSE355_Introduction-to-Blockchain\programming_assignments\PA2\test</w:t>
+      </w:r>
+    </w:p>
+    <w:p>
+      <w:pPr>
+        <w:spacing w:after="0" w:line="276" w:lineRule="auto"/>
+        <w:rPr>
+          <w:rFonts w:ascii="Times New Roman" w:hAnsi="Times New Roman" w:cs="Times New Roman"/>
+        </w:rPr>
+      </w:pPr>
+    </w:p>
+    <w:p>
+      <w:pPr>
+        <w:spacing w:after="0" w:line="276" w:lineRule="auto"/>
+        <w:rPr>
+          <w:rFonts w:ascii="Times New Roman" w:hAnsi="Times New Roman" w:cs="Times New Roman"/>
+        </w:rPr>
+      </w:pPr>
+    </w:p>
+    <w:p>
+      <w:pPr>
+        <w:spacing w:after="0" w:line="276" w:lineRule="auto"/>
+        <w:rPr>
+          <w:rFonts w:ascii="Times New Roman" w:hAnsi="Times New Roman" w:cs="Times New Roman"/>
+        </w:rPr>
+      </w:pPr>
+      <w:r>
+        <w:rPr>
+          <w:rFonts w:ascii="Times New Roman" w:hAnsi="Times New Roman" w:cs="Times New Roman"/>
+        </w:rPr>
+        <w:t xml:space="preserve">Mode                 </w:t>
+      </w:r>
+      <w:proofErr w:type="spellStart"/>
+      <w:r>
+        <w:rPr>
+          <w:rFonts w:ascii="Times New Roman" w:hAnsi="Times New Roman" w:cs="Times New Roman"/>
+        </w:rPr>
+        <w:t>LastWriteTime</w:t>
+      </w:r>
+      <w:proofErr w:type="spellEnd"/>
+      <w:r>
+        <w:rPr>
+          <w:rFonts w:ascii="Times New Roman" w:hAnsi="Times New Roman" w:cs="Times New Roman"/>
+        </w:rPr>
+        <w:t xml:space="preserve">         Length Name                                                                                                         </w:t>
+      </w:r>
+    </w:p>
+    <w:p>
+      <w:pPr>
+        <w:spacing w:after="0" w:line="276" w:lineRule="auto"/>
+        <w:rPr>
+          <w:rFonts w:ascii="Times New Roman" w:hAnsi="Times New Roman" w:cs="Times New Roman"/>
+        </w:rPr>
+      </w:pPr>
+      <w:r>
+        <w:rPr>
+          <w:rFonts w:ascii="Times New Roman" w:hAnsi="Times New Roman" w:cs="Times New Roman"/>
+        </w:rPr>
+        <w:t xml:space="preserve">----                 ------------- </w:t>
+      </w:r>
+      <w:proofErr w:type="gramStart"/>
+      <w:r>
+        <w:rPr>
+          <w:rFonts w:ascii="Times New Roman" w:hAnsi="Times New Roman" w:cs="Times New Roman"/>
+        </w:rPr>
+        <w:t xml:space="preserve">        </w:t>
+      </w:r>
+      <w:proofErr w:type="gramEnd"/>
+      <w:r>
+        <w:rPr>
+          <w:rFonts w:ascii="Times New Roman" w:hAnsi="Times New Roman" w:cs="Times New Roman"/>
+        </w:rPr>
+        <w:t xml:space="preserve">------ ----                                                                                                         </w:t>
+      </w:r>
+    </w:p>
+    <w:p>
+      <w:pPr>
+        <w:spacing w:after="0" w:line="276" w:lineRule="auto"/>
+        <w:rPr>
+          <w:rFonts w:ascii="Times New Roman" w:hAnsi="Times New Roman" w:cs="Times New Roman"/>
+        </w:rPr>
+      </w:pPr>
+      <w:r>
+        <w:rPr>
+          <w:rFonts w:ascii="Times New Roman" w:hAnsi="Times New Roman" w:cs="Times New Roman"/>
+        </w:rPr>
+        <w:t>-a---l         03-May-</w:t>
+      </w:r>
+      <w:proofErr w:type="gramStart"/>
+      <w:r>
+        <w:rPr>
+          <w:rFonts w:ascii="Times New Roman" w:hAnsi="Times New Roman" w:cs="Times New Roman"/>
+        </w:rPr>
+        <w:t>26  08:52</w:t>
+      </w:r>
+      <w:proofErr w:type="gramEnd"/>
+      <w:r>
+        <w:rPr>
+          <w:rFonts w:ascii="Times New Roman" w:hAnsi="Times New Roman" w:cs="Times New Roman"/>
+        </w:rPr>
+        <w:t xml:space="preserve"> PM           7030 banking_test.js                                                                                              </w:t>
+      </w:r>
+    </w:p>
+    <w:p>
+      <w:pPr>
+        <w:spacing w:after="0" w:line="276" w:lineRule="auto"/>
+        <w:rPr>
+          <w:rFonts w:ascii="Times New Roman" w:hAnsi="Times New Roman" w:cs="Times New Roman"/>
+        </w:rPr>
+      </w:pPr>
+      <w:r>
+        <w:rPr>
+          <w:rFonts w:ascii="Times New Roman" w:hAnsi="Times New Roman" w:cs="Times New Roman"/>
+        </w:rPr>
+        <w:t>-a---l         03-May-</w:t>
+      </w:r>
+      <w:proofErr w:type="gramStart"/>
+      <w:r>
+        <w:rPr>
+          <w:rFonts w:ascii="Times New Roman" w:hAnsi="Times New Roman" w:cs="Times New Roman"/>
+        </w:rPr>
+        <w:t>26  08:52</w:t>
+      </w:r>
+      <w:proofErr w:type="gramEnd"/>
+      <w:r>
+        <w:rPr>
+          <w:rFonts w:ascii="Times New Roman" w:hAnsi="Times New Roman" w:cs="Times New Roman"/>
+        </w:rPr>
+        <w:t xml:space="preserve"> PM           5641 exceptions_test.js                                                                                           </w:t>
+      </w:r>
+    </w:p>
+    <w:p>
+      <w:pPr>
+        <w:spacing w:after="0" w:line="276" w:lineRule="auto"/>
+        <w:rPr>
+          <w:rFonts w:ascii="Times New Roman" w:hAnsi="Times New Roman" w:cs="Times New Roman"/>
+        </w:rPr>
+      </w:pPr>
+      <w:r>
+        <w:rPr>
+          <w:rFonts w:ascii="Times New Roman" w:hAnsi="Times New Roman" w:cs="Times New Roman"/>
+        </w:rPr>
+        <w:t>-a---l         03-May-</w:t>
+      </w:r>
+      <w:proofErr w:type="gramStart"/>
+      <w:r>
+        <w:rPr>
+          <w:rFonts w:ascii="Times New Roman" w:hAnsi="Times New Roman" w:cs="Times New Roman"/>
+        </w:rPr>
+        <w:t>26  08:52</w:t>
+      </w:r>
+      <w:proofErr w:type="gramEnd"/>
+      <w:r>
+        <w:rPr>
+          <w:rFonts w:ascii="Times New Roman" w:hAnsi="Times New Roman" w:cs="Times New Roman"/>
+        </w:rPr>
+        <w:t xml:space="preserve"> PM           7018 interest_test.js                                                                                             </w:t>
+      </w:r>
+    </w:p>
+    <w:p>
+      <w:pPr>
+        <w:spacing w:after="0" w:line="276" w:lineRule="auto"/>
+        <w:rPr>
+          <w:rFonts w:ascii="Times New Roman" w:hAnsi="Times New Roman" w:cs="Times New Roman"/>
+        </w:rPr>
+      </w:pPr>
+      <w:r>
+        <w:rPr>
+          <w:rFonts w:ascii="Times New Roman" w:hAnsi="Times New Roman" w:cs="Times New Roman"/>
+        </w:rPr>
+        <w:t>-a----         03-May-</w:t>
+      </w:r>
+      <w:proofErr w:type="gramStart"/>
+      <w:r>
+        <w:rPr>
+          <w:rFonts w:ascii="Times New Roman" w:hAnsi="Times New Roman" w:cs="Times New Roman"/>
+        </w:rPr>
+        <w:t>26  09:27</w:t>
+      </w:r>
+      <w:proofErr w:type="gramEnd"/>
+      <w:r>
+        <w:rPr>
+          <w:rFonts w:ascii="Times New Roman" w:hAnsi="Times New Roman" w:cs="Times New Roman"/>
+        </w:rPr>
+        <w:t xml:space="preserve"> PM           4317 Lock.js                                                                                                      </w:t>
+      </w:r>
+    </w:p>
+    <w:p>
+      <w:pPr>
+        <w:spacing w:after="0" w:line="276" w:lineRule="auto"/>
+        <w:rPr>
+          <w:rFonts w:ascii="Times New Roman" w:hAnsi="Times New Roman" w:cs="Times New Roman"/>
+        </w:rPr>
+      </w:pPr>
+      <w:r>
+        <w:rPr>
+          <w:rFonts w:ascii="Times New Roman" w:hAnsi="Times New Roman" w:cs="Times New Roman"/>
+        </w:rPr>
+        <w:t>-a---l         03-May-</w:t>
+      </w:r>
+      <w:proofErr w:type="gramStart"/>
+      <w:r>
+        <w:rPr>
+          <w:rFonts w:ascii="Times New Roman" w:hAnsi="Times New Roman" w:cs="Times New Roman"/>
+        </w:rPr>
+        <w:t>26  08:52</w:t>
+      </w:r>
+      <w:proofErr w:type="gramEnd"/>
+      <w:r>
+        <w:rPr>
+          <w:rFonts w:ascii="Times New Roman" w:hAnsi="Times New Roman" w:cs="Times New Roman"/>
+        </w:rPr>
+        <w:t xml:space="preserve"> PM           3084 owner_test.js                                                                                                </w:t>
+      </w:r>
+    </w:p>
+    <w:p>
+      <w:pPr>
+        <w:spacing w:after="0" w:line="276" w:lineRule="auto"/>
+        <w:rPr>
+          <w:rFonts w:ascii="Times New Roman" w:hAnsi="Times New Roman" w:cs="Times New Roman"/>
+        </w:rPr>
+      </w:pPr>
     </w:p>
     <w:sectPr>
       <w:pgSz w:w="12240" w:h="15840"/>
@@ -2788,6 +5742,29 @@
       <w:spacing w:val="5"/>
     </w:rPr>
   </w:style>
+  <w:style w:type="character" w:styleId="Hyperlink">
+    <w:name w:val="Hyperlink"/>
+    <w:basedOn w:val="DefaultParagraphFont"/>
+    <w:uiPriority w:val="99"/>
+    <w:unhideWhenUsed/>
+    <w:rsid w:val="005B159D"/>
+    <w:rPr>
+      <w:color w:val="467886" w:themeColor="hyperlink"/>
+      <w:u w:val="single"/>
+    </w:rPr>
+  </w:style>
+  <w:style w:type="character" w:styleId="UnresolvedMention">
+    <w:name w:val="Unresolved Mention"/>
+    <w:basedOn w:val="DefaultParagraphFont"/>
+    <w:uiPriority w:val="99"/>
+    <w:semiHidden/>
+    <w:unhideWhenUsed/>
+    <w:rsid w:val="005B159D"/>
+    <w:rPr>
+      <w:color w:val="605E5C"/>
+      <w:shd w:val="clear" w:color="auto" w:fill="E1DFDD"/>
+    </w:rPr>
+  </w:style>
 </w:styles>
 </file>
 

</xml_diff>